<commit_message>
docs: shorten practical report using provided example
</commit_message>
<xml_diff>
--- a/reports/Отчет_КР1_Инструменты_Девопс_Изосимов_МИ.docx
+++ b/reports/Отчет_КР1_Инструменты_Девопс_Изосимов_МИ.docx
@@ -2,37 +2,44 @@
 <file path=word/document.xml><?xml version="1.0" encoding="utf-8"?>
 <w:document xmlns:wpc="http://schemas.microsoft.com/office/word/2010/wordprocessingCanvas" xmlns:mo="http://schemas.microsoft.com/office/mac/office/2008/main" xmlns:mc="http://schemas.openxmlformats.org/markup-compatibility/2006" xmlns:mv="urn:schemas-microsoft-com:mac:vml" xmlns:o="urn:schemas-microsoft-com:office:office" xmlns:r="http://schemas.openxmlformats.org/officeDocument/2006/relationships" xmlns:m="http://schemas.openxmlformats.org/officeDocument/2006/math" xmlns:v="urn:schemas-microsoft-com:vml" xmlns:wp14="http://schemas.microsoft.com/office/word/2010/wordprocessingDrawing" xmlns:wp="http://schemas.openxmlformats.org/drawingml/2006/wordprocessingDrawing" xmlns:w10="urn:schemas-microsoft-com:office:word" xmlns:w="http://schemas.openxmlformats.org/wordprocessingml/2006/main" xmlns:w14="http://schemas.microsoft.com/office/word/2010/wordml" xmlns:wpg="http://schemas.microsoft.com/office/word/2010/wordprocessingGroup" xmlns:wpi="http://schemas.microsoft.com/office/word/2010/wordprocessingInk" xmlns:wne="http://schemas.microsoft.com/office/word/2006/wordml" xmlns:wps="http://schemas.microsoft.com/office/word/2010/wordprocessingShape" mc:Ignorable="w14 wp14">
   <w:body>
+    <w:p/>
+    <w:p/>
+    <w:p/>
     <w:p>
       <w:pPr>
-        <w:ind w:firstLine="0"/>
         <w:jc w:val="center"/>
       </w:pPr>
       <w:r>
         <w:rPr>
-          <w:b w:val="0"/>
-          <w:sz w:val="24"/>
+          <w:b/>
+          <w:sz w:val="32"/>
         </w:rPr>
-        <w:t>МИНОБРНАУКИ РОССИИ</w:t>
+        <w:t>РТУ МИРЭА</w:t>
       </w:r>
     </w:p>
     <w:p>
       <w:pPr>
-        <w:ind w:firstLine="0"/>
         <w:jc w:val="center"/>
       </w:pPr>
       <w:r>
         <w:rPr>
-          <w:b w:val="0"/>
-          <w:sz w:val="22"/>
+          <w:sz w:val="26"/>
         </w:rPr>
-        <w:t>Федеральное государственное бюджетное образовательное</w:t>
-        <w:br/>
-        <w:t>учреждение высшего образования</w:t>
+        <w:t>Кафедра индустриального программирования</w:t>
+      </w:r>
+    </w:p>
+    <w:p/>
+    <w:p>
+      <w:pPr>
+        <w:pStyle w:val="Title"/>
+        <w:jc w:val="center"/>
+      </w:pPr>
+      <w:r>
+        <w:t>Отчёт по практической работе №2</w:t>
       </w:r>
     </w:p>
     <w:p>
       <w:pPr>
-        <w:ind w:firstLine="0"/>
         <w:jc w:val="center"/>
       </w:pPr>
       <w:r>
@@ -40,149 +47,759 @@
           <w:b/>
           <w:sz w:val="28"/>
         </w:rPr>
-        <w:t>«МИРЭА — Российский технологический университет»</w:t>
-        <w:br/>
-        <w:t>РТУ МИРЭА</w:t>
+        <w:t>Организация инфраструктуры программного проекта в GitHub</w:t>
+      </w:r>
+    </w:p>
+    <w:p/>
+    <w:p>
+      <w:pPr>
+        <w:jc w:val="center"/>
+      </w:pPr>
+      <w:r>
+        <w:t>Дисциплина «Инструменты DevOps»</w:t>
+      </w:r>
+    </w:p>
+    <w:p/>
+    <w:p/>
+    <w:p/>
+    <w:p/>
+    <w:p/>
+    <w:tbl>
+      <w:tblPr>
+        <w:tblW w:type="auto" w:w="0"/>
+        <w:tblLayout w:type="fixed"/>
+        <w:tblLook w:firstColumn="1" w:firstRow="1" w:lastColumn="0" w:lastRow="0" w:noHBand="0" w:noVBand="1" w:val="04A0"/>
+      </w:tblPr>
+      <w:tblGrid>
+        <w:gridCol w:w="2880"/>
+        <w:gridCol w:w="6048"/>
+      </w:tblGrid>
+      <w:tr>
+        <w:tc>
+          <w:tcPr>
+            <w:tcW w:type="dxa" w:w="4968"/>
+            <w:vAlign w:val="center"/>
+            <w:tcBorders>
+              <w:top w:val="single" w:sz="4" w:color="D9D9D9"/>
+              <w:left w:val="single" w:sz="4" w:color="D9D9D9"/>
+              <w:bottom w:val="single" w:sz="4" w:color="D9D9D9"/>
+              <w:right w:val="single" w:sz="4" w:color="D9D9D9"/>
+              <w:insideH w:val="single" w:sz="4" w:color="D9D9D9"/>
+              <w:insideV w:val="single" w:sz="4" w:color="D9D9D9"/>
+            </w:tcBorders>
+          </w:tcPr>
+          <w:p>
+            <w:pPr>
+              <w:spacing w:after="0"/>
+            </w:pPr>
+            <w:r>
+              <w:t>Выполнил</w:t>
+            </w:r>
+          </w:p>
+        </w:tc>
+        <w:tc>
+          <w:tcPr>
+            <w:tcW w:type="dxa" w:w="4968"/>
+            <w:vAlign w:val="center"/>
+            <w:tcBorders>
+              <w:top w:val="single" w:sz="4" w:color="D9D9D9"/>
+              <w:left w:val="single" w:sz="4" w:color="D9D9D9"/>
+              <w:bottom w:val="single" w:sz="4" w:color="D9D9D9"/>
+              <w:right w:val="single" w:sz="4" w:color="D9D9D9"/>
+              <w:insideH w:val="single" w:sz="4" w:color="D9D9D9"/>
+              <w:insideV w:val="single" w:sz="4" w:color="D9D9D9"/>
+            </w:tcBorders>
+          </w:tcPr>
+          <w:p>
+            <w:pPr>
+              <w:spacing w:after="0"/>
+            </w:pPr>
+            <w:r>
+              <w:t>Изосимов Максим Игоревич</w:t>
+            </w:r>
+          </w:p>
+        </w:tc>
+      </w:tr>
+      <w:tr>
+        <w:tc>
+          <w:tcPr>
+            <w:tcW w:type="dxa" w:w="4968"/>
+            <w:vAlign w:val="center"/>
+            <w:tcBorders>
+              <w:top w:val="single" w:sz="4" w:color="D9D9D9"/>
+              <w:left w:val="single" w:sz="4" w:color="D9D9D9"/>
+              <w:bottom w:val="single" w:sz="4" w:color="D9D9D9"/>
+              <w:right w:val="single" w:sz="4" w:color="D9D9D9"/>
+              <w:insideH w:val="single" w:sz="4" w:color="D9D9D9"/>
+              <w:insideV w:val="single" w:sz="4" w:color="D9D9D9"/>
+            </w:tcBorders>
+          </w:tcPr>
+          <w:p>
+            <w:pPr>
+              <w:spacing w:after="0"/>
+            </w:pPr>
+            <w:r>
+              <w:t>Группа</w:t>
+            </w:r>
+          </w:p>
+        </w:tc>
+        <w:tc>
+          <w:tcPr>
+            <w:tcW w:type="dxa" w:w="4968"/>
+            <w:vAlign w:val="center"/>
+            <w:tcBorders>
+              <w:top w:val="single" w:sz="4" w:color="D9D9D9"/>
+              <w:left w:val="single" w:sz="4" w:color="D9D9D9"/>
+              <w:bottom w:val="single" w:sz="4" w:color="D9D9D9"/>
+              <w:right w:val="single" w:sz="4" w:color="D9D9D9"/>
+              <w:insideH w:val="single" w:sz="4" w:color="D9D9D9"/>
+              <w:insideV w:val="single" w:sz="4" w:color="D9D9D9"/>
+            </w:tcBorders>
+          </w:tcPr>
+          <w:p>
+            <w:r>
+              <w:t>ЭФБО-11-24</w:t>
+            </w:r>
+          </w:p>
+        </w:tc>
+      </w:tr>
+      <w:tr>
+        <w:tc>
+          <w:tcPr>
+            <w:tcW w:type="dxa" w:w="4968"/>
+            <w:vAlign w:val="center"/>
+            <w:tcBorders>
+              <w:top w:val="single" w:sz="4" w:color="D9D9D9"/>
+              <w:left w:val="single" w:sz="4" w:color="D9D9D9"/>
+              <w:bottom w:val="single" w:sz="4" w:color="D9D9D9"/>
+              <w:right w:val="single" w:sz="4" w:color="D9D9D9"/>
+              <w:insideH w:val="single" w:sz="4" w:color="D9D9D9"/>
+              <w:insideV w:val="single" w:sz="4" w:color="D9D9D9"/>
+            </w:tcBorders>
+          </w:tcPr>
+          <w:p>
+            <w:pPr>
+              <w:spacing w:after="0"/>
+            </w:pPr>
+            <w:r>
+              <w:t>Год</w:t>
+            </w:r>
+          </w:p>
+        </w:tc>
+        <w:tc>
+          <w:tcPr>
+            <w:tcW w:type="dxa" w:w="4968"/>
+            <w:vAlign w:val="center"/>
+            <w:tcBorders>
+              <w:top w:val="single" w:sz="4" w:color="D9D9D9"/>
+              <w:left w:val="single" w:sz="4" w:color="D9D9D9"/>
+              <w:bottom w:val="single" w:sz="4" w:color="D9D9D9"/>
+              <w:right w:val="single" w:sz="4" w:color="D9D9D9"/>
+              <w:insideH w:val="single" w:sz="4" w:color="D9D9D9"/>
+              <w:insideV w:val="single" w:sz="4" w:color="D9D9D9"/>
+            </w:tcBorders>
+          </w:tcPr>
+          <w:p>
+            <w:pPr>
+              <w:spacing w:after="0"/>
+            </w:pPr>
+            <w:r>
+              <w:t>2026</w:t>
+            </w:r>
+          </w:p>
+        </w:tc>
+      </w:tr>
+    </w:tbl>
+    <w:p>
+      <w:r>
+        <w:br w:type="page"/>
       </w:r>
     </w:p>
     <w:p>
       <w:pPr>
-        <w:ind w:firstLine="0"/>
+        <w:pStyle w:val="Heading1"/>
+      </w:pPr>
+      <w:r>
+        <w:t>Цель и задачи работы</w:t>
+      </w:r>
+    </w:p>
+    <w:p>
+      <w:pPr>
+        <w:jc w:val="both"/>
+      </w:pPr>
+      <w:r>
+        <w:t>Цель работы — подготовить инфраструктуру программного проекта: репозиторий Git, документацию и список задач в GitHub.</w:t>
+      </w:r>
+    </w:p>
+    <w:p>
+      <w:pPr>
+        <w:pStyle w:val="ListBullet"/>
+        <w:spacing w:after="60"/>
+      </w:pPr>
+      <w:r>
+        <w:t>создать публичный удалённый и локальный репозитории и связать их;</w:t>
+      </w:r>
+    </w:p>
+    <w:p>
+      <w:pPr>
+        <w:pStyle w:val="ListBullet"/>
+        <w:spacing w:after="60"/>
+      </w:pPr>
+      <w:r>
+        <w:t>подготовить основные файлы проекта и раздел документации;</w:t>
+      </w:r>
+    </w:p>
+    <w:p>
+      <w:pPr>
+        <w:pStyle w:val="ListBullet"/>
+        <w:spacing w:after="60"/>
+      </w:pPr>
+      <w:r>
+        <w:t>зафиксировать изменения коммитами и отправить их в GitHub;</w:t>
+      </w:r>
+    </w:p>
+    <w:p>
+      <w:pPr>
+        <w:pStyle w:val="ListBullet"/>
+        <w:spacing w:after="60"/>
+      </w:pPr>
+      <w:r>
+        <w:t>создать задачи проекта и организовать их список;</w:t>
+      </w:r>
+    </w:p>
+    <w:p>
+      <w:pPr>
+        <w:pStyle w:val="ListBullet"/>
+        <w:spacing w:after="60"/>
+      </w:pPr>
+      <w:r>
+        <w:t>подготовить отчёт со скриншотами и ссылкой на репозиторий.</w:t>
+      </w:r>
+    </w:p>
+    <w:p>
+      <w:pPr>
+        <w:pStyle w:val="Heading1"/>
+      </w:pPr>
+      <w:r>
+        <w:t>Использованные средства</w:t>
+      </w:r>
+    </w:p>
+    <w:tbl>
+      <w:tblPr>
+        <w:tblStyle w:val="TableGrid"/>
+        <w:tblW w:type="auto" w:w="0"/>
+        <w:tblLook w:firstColumn="1" w:firstRow="1" w:lastColumn="0" w:lastRow="0" w:noHBand="0" w:noVBand="1" w:val="04A0"/>
+      </w:tblPr>
+      <w:tblGrid>
+        <w:gridCol w:w="4968"/>
+        <w:gridCol w:w="4968"/>
+      </w:tblGrid>
+      <w:tr>
+        <w:tc>
+          <w:tcPr>
+            <w:tcW w:type="dxa" w:w="4968"/>
+            <w:shd w:fill="1F4E78"/>
+          </w:tcPr>
+          <w:p>
+            <w:r>
+              <w:rPr>
+                <w:b/>
+                <w:color w:val="FFFFFF"/>
+              </w:rPr>
+              <w:t>Средство</w:t>
+            </w:r>
+          </w:p>
+        </w:tc>
+        <w:tc>
+          <w:tcPr>
+            <w:tcW w:type="dxa" w:w="4968"/>
+            <w:shd w:fill="1F4E78"/>
+          </w:tcPr>
+          <w:p>
+            <w:r>
+              <w:rPr>
+                <w:b/>
+                <w:color w:val="FFFFFF"/>
+              </w:rPr>
+              <w:t>Назначение</w:t>
+            </w:r>
+          </w:p>
+        </w:tc>
+      </w:tr>
+      <w:tr>
+        <w:tc>
+          <w:tcPr>
+            <w:tcW w:type="dxa" w:w="4968"/>
+            <w:vAlign w:val="center"/>
+          </w:tcPr>
+          <w:p>
+            <w:r>
+              <w:t>Git и SSH</w:t>
+            </w:r>
+          </w:p>
+        </w:tc>
+        <w:tc>
+          <w:tcPr>
+            <w:tcW w:type="dxa" w:w="4968"/>
+            <w:vAlign w:val="center"/>
+          </w:tcPr>
+          <w:p>
+            <w:r>
+              <w:t>Локальная история изменений и безопасный доступ к удалённому репозиторию</w:t>
+            </w:r>
+          </w:p>
+        </w:tc>
+      </w:tr>
+      <w:tr>
+        <w:tc>
+          <w:tcPr>
+            <w:tcW w:type="dxa" w:w="4968"/>
+            <w:vAlign w:val="center"/>
+          </w:tcPr>
+          <w:p>
+            <w:r>
+              <w:t>GitHub</w:t>
+            </w:r>
+          </w:p>
+        </w:tc>
+        <w:tc>
+          <w:tcPr>
+            <w:tcW w:type="dxa" w:w="4968"/>
+            <w:vAlign w:val="center"/>
+          </w:tcPr>
+          <w:p>
+            <w:r>
+              <w:t>Хранение репозитория и просмотр истории коммитов</w:t>
+            </w:r>
+          </w:p>
+        </w:tc>
+      </w:tr>
+      <w:tr>
+        <w:tc>
+          <w:tcPr>
+            <w:tcW w:type="dxa" w:w="4968"/>
+            <w:vAlign w:val="center"/>
+          </w:tcPr>
+          <w:p>
+            <w:r>
+              <w:t>GitHub Issues</w:t>
+            </w:r>
+          </w:p>
+        </w:tc>
+        <w:tc>
+          <w:tcPr>
+            <w:tcW w:type="dxa" w:w="4968"/>
+            <w:vAlign w:val="center"/>
+          </w:tcPr>
+          <w:p>
+            <w:r>
+              <w:t>Регистрация задач проекта</w:t>
+            </w:r>
+          </w:p>
+        </w:tc>
+      </w:tr>
+      <w:tr>
+        <w:tc>
+          <w:tcPr>
+            <w:tcW w:type="dxa" w:w="4968"/>
+            <w:vAlign w:val="center"/>
+          </w:tcPr>
+          <w:p>
+            <w:r>
+              <w:t>TASKS.md</w:t>
+            </w:r>
+          </w:p>
+        </w:tc>
+        <w:tc>
+          <w:tcPr>
+            <w:tcW w:type="dxa" w:w="4968"/>
+            <w:vAlign w:val="center"/>
+          </w:tcPr>
+          <w:p>
+            <w:r>
+              <w:t>Список задач проекта с отметками выполнения</w:t>
+            </w:r>
+          </w:p>
+        </w:tc>
+      </w:tr>
+      <w:tr>
+        <w:tc>
+          <w:tcPr>
+            <w:tcW w:type="dxa" w:w="4968"/>
+            <w:vAlign w:val="center"/>
+          </w:tcPr>
+          <w:p>
+            <w:r>
+              <w:t>Python unittest</w:t>
+            </w:r>
+          </w:p>
+        </w:tc>
+        <w:tc>
+          <w:tcPr>
+            <w:tcW w:type="dxa" w:w="4968"/>
+            <w:vAlign w:val="center"/>
+          </w:tcPr>
+          <w:p>
+            <w:r>
+              <w:t>Проверка корректности функций проекта</w:t>
+            </w:r>
+          </w:p>
+        </w:tc>
+      </w:tr>
+    </w:tbl>
+    <w:p>
+      <w:pPr>
+        <w:pStyle w:val="Heading1"/>
+      </w:pPr>
+      <w:r>
+        <w:t>Ход выполнения работы</w:t>
+      </w:r>
+    </w:p>
+    <w:p>
+      <w:pPr>
+        <w:jc w:val="both"/>
+      </w:pPr>
+      <w:r>
+        <w:t>1. В GitHub создан публичный репозиторий devops-course-2026. Локальный Git-репозиторий связан с ним через origin. Добавлены папки src, tests, docs и reports, файлы README.md, TASKS.md и .gitignore. Описание проекта и команды работы размещены в docs/README.md.</w:t>
+      </w:r>
+    </w:p>
+    <w:p>
+      <w:pPr>
+        <w:keepNext/>
+        <w:jc w:val="center"/>
+      </w:pPr>
+      <w:r>
+        <w:drawing>
+          <wp:inline xmlns:a="http://schemas.openxmlformats.org/drawingml/2006/main" xmlns:pic="http://schemas.openxmlformats.org/drawingml/2006/picture">
+            <wp:extent cx="3909145" cy="4286250"/>
+            <wp:docPr id="1" name="Picture 1" descr="Репозиторий GitHub"/>
+            <wp:cNvGraphicFramePr>
+              <a:graphicFrameLocks noChangeAspect="1"/>
+            </wp:cNvGraphicFramePr>
+            <a:graphic>
+              <a:graphicData uri="http://schemas.openxmlformats.org/drawingml/2006/picture">
+                <pic:pic>
+                  <pic:nvPicPr>
+                    <pic:cNvPr id="0" name="01_repository.png"/>
+                    <pic:cNvPicPr/>
+                  </pic:nvPicPr>
+                  <pic:blipFill>
+                    <a:blip r:embed="rId10"/>
+                    <a:stretch>
+                      <a:fillRect/>
+                    </a:stretch>
+                  </pic:blipFill>
+                  <pic:spPr>
+                    <a:xfrm>
+                      <a:off x="0" y="0"/>
+                      <a:ext cx="3909145" cy="4286250"/>
+                    </a:xfrm>
+                    <a:prstGeom prst="rect"/>
+                  </pic:spPr>
+                </pic:pic>
+              </a:graphicData>
+            </a:graphic>
+          </wp:inline>
+        </w:drawing>
+      </w:r>
+    </w:p>
+    <w:p>
+      <w:pPr>
+        <w:spacing w:after="160"/>
         <w:jc w:val="center"/>
       </w:pPr>
       <w:r>
         <w:rPr>
-          <w:b w:val="0"/>
+          <w:i/>
+          <w:sz w:val="20"/>
         </w:rPr>
-        <w:t>Институт перспективных технологий</w:t>
-        <w:br/>
-        <w:t>и индустриального программирования</w:t>
-        <w:br/>
-        <w:t>Кафедра индустриального программирования</w:t>
+        <w:t>Рисунок 1 — Репозиторий и структура файлов проекта</w:t>
       </w:r>
     </w:p>
     <w:p>
       <w:r>
+        <w:br w:type="page"/>
+      </w:r>
+    </w:p>
+    <w:p>
+      <w:pPr>
+        <w:pStyle w:val="Heading2"/>
+      </w:pPr>
+      <w:r>
+        <w:t>Фиксация изменений</w:t>
+      </w:r>
+    </w:p>
+    <w:p>
+      <w:pPr>
+        <w:jc w:val="both"/>
+      </w:pPr>
+      <w:r>
+        <w:t>2. Изменения сохранены коммитами и отправлены командой git push origin main. В истории GitHub видны создание структуры проекта, добавление документации и публикация отчёта. Основные файлы доступны в ветке main.</w:t>
+      </w:r>
+    </w:p>
+    <w:p>
+      <w:pPr>
+        <w:keepNext/>
+        <w:jc w:val="center"/>
+      </w:pPr>
+      <w:r>
+        <w:drawing>
+          <wp:inline xmlns:a="http://schemas.openxmlformats.org/drawingml/2006/main" xmlns:pic="http://schemas.openxmlformats.org/drawingml/2006/picture">
+            <wp:extent cx="3909145" cy="4286250"/>
+            <wp:docPr id="2" name="Picture 2" descr="История коммитов"/>
+            <wp:cNvGraphicFramePr>
+              <a:graphicFrameLocks noChangeAspect="1"/>
+            </wp:cNvGraphicFramePr>
+            <a:graphic>
+              <a:graphicData uri="http://schemas.openxmlformats.org/drawingml/2006/picture">
+                <pic:pic>
+                  <pic:nvPicPr>
+                    <pic:cNvPr id="0" name="02_commits.png"/>
+                    <pic:cNvPicPr/>
+                  </pic:nvPicPr>
+                  <pic:blipFill>
+                    <a:blip r:embed="rId11"/>
+                    <a:stretch>
+                      <a:fillRect/>
+                    </a:stretch>
+                  </pic:blipFill>
+                  <pic:spPr>
+                    <a:xfrm>
+                      <a:off x="0" y="0"/>
+                      <a:ext cx="3909145" cy="4286250"/>
+                    </a:xfrm>
+                    <a:prstGeom prst="rect"/>
+                  </pic:spPr>
+                </pic:pic>
+              </a:graphicData>
+            </a:graphic>
+          </wp:inline>
+        </w:drawing>
+      </w:r>
+    </w:p>
+    <w:p>
+      <w:pPr>
+        <w:spacing w:after="160"/>
+        <w:jc w:val="center"/>
+      </w:pPr>
+      <w:r>
         <w:rPr>
-          <w:b w:val="0"/>
+          <w:i/>
+          <w:sz w:val="20"/>
         </w:rPr>
+        <w:t>Рисунок 2 — История коммитов в ветке main</w:t>
+      </w:r>
+    </w:p>
+    <w:p>
+      <w:pPr>
+        <w:pStyle w:val="Heading2"/>
+      </w:pPr>
+      <w:r>
+        <w:t>Планирование задач</w:t>
+      </w:r>
+    </w:p>
+    <w:p>
+      <w:pPr>
+        <w:jc w:val="both"/>
+      </w:pPr>
+      <w:r>
+        <w:t>3. В GitHub Issues созданы задачи проекта. Подготовка инфраструктуры и отчёта отмечена выполненной. Добавление дедлайнов и контейнеризация с автоматическими проверками внесены в список дальнейших работ.</w:t>
+      </w:r>
+    </w:p>
+    <w:p>
+      <w:pPr>
+        <w:keepNext/>
+        <w:jc w:val="center"/>
+      </w:pPr>
+      <w:r>
+        <w:drawing>
+          <wp:inline xmlns:a="http://schemas.openxmlformats.org/drawingml/2006/main" xmlns:pic="http://schemas.openxmlformats.org/drawingml/2006/picture">
+            <wp:extent cx="3909145" cy="4286250"/>
+            <wp:docPr id="3" name="Picture 3" descr="Задачи GitHub Issues"/>
+            <wp:cNvGraphicFramePr>
+              <a:graphicFrameLocks noChangeAspect="1"/>
+            </wp:cNvGraphicFramePr>
+            <a:graphic>
+              <a:graphicData uri="http://schemas.openxmlformats.org/drawingml/2006/picture">
+                <pic:pic>
+                  <pic:nvPicPr>
+                    <pic:cNvPr id="0" name="03_issues.png"/>
+                    <pic:cNvPicPr/>
+                  </pic:nvPicPr>
+                  <pic:blipFill>
+                    <a:blip r:embed="rId12"/>
+                    <a:stretch>
+                      <a:fillRect/>
+                    </a:stretch>
+                  </pic:blipFill>
+                  <pic:spPr>
+                    <a:xfrm>
+                      <a:off x="0" y="0"/>
+                      <a:ext cx="3909145" cy="4286250"/>
+                    </a:xfrm>
+                    <a:prstGeom prst="rect"/>
+                  </pic:spPr>
+                </pic:pic>
+              </a:graphicData>
+            </a:graphic>
+          </wp:inline>
+        </w:drawing>
+      </w:r>
+    </w:p>
+    <w:p>
+      <w:pPr>
+        <w:spacing w:after="160"/>
+        <w:jc w:val="center"/>
+      </w:pPr>
+      <w:r>
+        <w:rPr>
+          <w:i/>
+          <w:sz w:val="20"/>
+        </w:rPr>
+        <w:t>Рисунок 3 — Список задач GitHub Issues</w:t>
       </w:r>
     </w:p>
     <w:p>
       <w:r>
-        <w:rPr>
-          <w:b w:val="0"/>
-        </w:rPr>
+        <w:br w:type="page"/>
       </w:r>
     </w:p>
     <w:p>
       <w:pPr>
-        <w:pStyle w:val="Title"/>
-        <w:jc w:val="center"/>
+        <w:pStyle w:val="Heading2"/>
       </w:pPr>
       <w:r>
-        <w:t>ОТЧЁТ ПО КОНТРОЛЬНОЙ РАБОТЕ 1</w:t>
+        <w:t>Список задач проекта</w:t>
       </w:r>
     </w:p>
     <w:p>
       <w:pPr>
-        <w:ind w:firstLine="0"/>
+        <w:jc w:val="both"/>
+      </w:pPr>
+      <w:r>
+        <w:t>4. Задачи организованы в файле TASKS.md с разделами «Запланировано» и «Выполнено». Каждый пункт содержит ссылку на GitHub Issue. Такой список предусмотрен заданием как альтернатива доске GitHub Projects.</w:t>
+      </w:r>
+    </w:p>
+    <w:p>
+      <w:pPr>
+        <w:keepNext/>
+        <w:jc w:val="center"/>
+      </w:pPr>
+      <w:r>
+        <w:drawing>
+          <wp:inline xmlns:a="http://schemas.openxmlformats.org/drawingml/2006/main" xmlns:pic="http://schemas.openxmlformats.org/drawingml/2006/picture">
+            <wp:extent cx="3166407" cy="3471862"/>
+            <wp:docPr id="4" name="Picture 4" descr="Список задач TASKS.md"/>
+            <wp:cNvGraphicFramePr>
+              <a:graphicFrameLocks noChangeAspect="1"/>
+            </wp:cNvGraphicFramePr>
+            <a:graphic>
+              <a:graphicData uri="http://schemas.openxmlformats.org/drawingml/2006/picture">
+                <pic:pic>
+                  <pic:nvPicPr>
+                    <pic:cNvPr id="0" name="04_project_board.png"/>
+                    <pic:cNvPicPr/>
+                  </pic:nvPicPr>
+                  <pic:blipFill>
+                    <a:blip r:embed="rId13"/>
+                    <a:stretch>
+                      <a:fillRect/>
+                    </a:stretch>
+                  </pic:blipFill>
+                  <pic:spPr>
+                    <a:xfrm>
+                      <a:off x="0" y="0"/>
+                      <a:ext cx="3166407" cy="3471862"/>
+                    </a:xfrm>
+                    <a:prstGeom prst="rect"/>
+                  </pic:spPr>
+                </pic:pic>
+              </a:graphicData>
+            </a:graphic>
+          </wp:inline>
+        </w:drawing>
+      </w:r>
+    </w:p>
+    <w:p>
+      <w:pPr>
+        <w:spacing w:after="160"/>
         <w:jc w:val="center"/>
       </w:pPr>
       <w:r>
         <w:rPr>
-          <w:b w:val="0"/>
-          <w:sz w:val="28"/>
+          <w:i/>
+          <w:sz w:val="20"/>
         </w:rPr>
-        <w:t>по дисциплине «Инструменты Девопс»</w:t>
+        <w:t>Рисунок 4 — Список задач проекта в TASKS.md</w:t>
       </w:r>
     </w:p>
     <w:p>
       <w:pPr>
-        <w:ind w:firstLine="0"/>
+        <w:pStyle w:val="Heading2"/>
+      </w:pPr>
+      <w:r>
+        <w:t>Проверка результата</w:t>
+      </w:r>
+    </w:p>
+    <w:p>
+      <w:pPr>
+        <w:jc w:val="both"/>
+      </w:pPr>
+      <w:r>
+        <w:t>5. Проверены запуск программы и работа с задачами: добавление, просмотр и завершение. Команда python3 -m unittest discover -s tests -v выполнила три теста успешно. Результат сохранён в журнале и открыт в редакторе.</w:t>
+      </w:r>
+    </w:p>
+    <w:p>
+      <w:pPr>
+        <w:keepNext/>
+        <w:jc w:val="center"/>
+      </w:pPr>
+      <w:r>
+        <w:drawing>
+          <wp:inline xmlns:a="http://schemas.openxmlformats.org/drawingml/2006/main" xmlns:pic="http://schemas.openxmlformats.org/drawingml/2006/picture">
+            <wp:extent cx="5657693" cy="3445764"/>
+            <wp:docPr id="5" name="Picture 5" descr="Журнал тестов и запуска"/>
+            <wp:cNvGraphicFramePr>
+              <a:graphicFrameLocks noChangeAspect="1"/>
+            </wp:cNvGraphicFramePr>
+            <a:graphic>
+              <a:graphicData uri="http://schemas.openxmlformats.org/drawingml/2006/picture">
+                <pic:pic>
+                  <pic:nvPicPr>
+                    <pic:cNvPr id="0" name="05_terminal.png"/>
+                    <pic:cNvPicPr/>
+                  </pic:nvPicPr>
+                  <pic:blipFill>
+                    <a:blip r:embed="rId14"/>
+                    <a:stretch>
+                      <a:fillRect/>
+                    </a:stretch>
+                  </pic:blipFill>
+                  <pic:spPr>
+                    <a:xfrm>
+                      <a:off x="0" y="0"/>
+                      <a:ext cx="5657693" cy="3445764"/>
+                    </a:xfrm>
+                    <a:prstGeom prst="rect"/>
+                  </pic:spPr>
+                </pic:pic>
+              </a:graphicData>
+            </a:graphic>
+          </wp:inline>
+        </w:drawing>
+      </w:r>
+    </w:p>
+    <w:p>
+      <w:pPr>
+        <w:spacing w:after="160"/>
         <w:jc w:val="center"/>
       </w:pPr>
       <w:r>
         <w:rPr>
-          <w:b/>
-          <w:sz w:val="28"/>
+          <w:i/>
+          <w:sz w:val="20"/>
         </w:rPr>
-        <w:t>Создание инфраструктуры проекта</w:t>
-        <w:br/>
-        <w:t>и работа с Git и GitHub</w:t>
-      </w:r>
-    </w:p>
-    <w:p>
-      <w:pPr>
-        <w:ind w:firstLine="0"/>
-        <w:jc w:val="center"/>
-      </w:pPr>
-      <w:r>
-        <w:rPr>
-          <w:b w:val="0"/>
-        </w:rPr>
-        <w:t>Учебный проект StudyTasks</w:t>
-      </w:r>
-    </w:p>
-    <w:p>
-      <w:r>
-        <w:rPr>
-          <w:b w:val="0"/>
-        </w:rPr>
-      </w:r>
-    </w:p>
-    <w:p>
-      <w:r>
-        <w:rPr>
-          <w:b w:val="0"/>
-        </w:rPr>
-      </w:r>
-    </w:p>
-    <w:p>
-      <w:pPr>
-        <w:ind w:firstLine="0"/>
-        <w:jc w:val="right"/>
-      </w:pPr>
-      <w:r>
-        <w:rPr>
-          <w:b w:val="0"/>
-        </w:rPr>
-        <w:t>Выполнил студент группы ЭФБО-11-24</w:t>
-        <w:br/>
-        <w:t>Изосимов Максим Игоревич</w:t>
-      </w:r>
-    </w:p>
-    <w:p>
-      <w:pPr>
-        <w:ind w:firstLine="0"/>
-        <w:jc w:val="right"/>
-      </w:pPr>
-      <w:r>
-        <w:rPr>
-          <w:b w:val="0"/>
-        </w:rPr>
-        <w:t>Преподаватель</w:t>
-        <w:br/>
-        <w:t>Гиматдинов Дамир Маратович</w:t>
-      </w:r>
-    </w:p>
-    <w:p>
-      <w:r>
-        <w:rPr>
-          <w:b w:val="0"/>
-        </w:rPr>
-      </w:r>
-    </w:p>
-    <w:p>
-      <w:pPr>
-        <w:ind w:firstLine="0"/>
-        <w:jc w:val="center"/>
-      </w:pPr>
-      <w:r>
-        <w:rPr>
-          <w:b w:val="0"/>
-        </w:rPr>
-        <w:t>Москва 2026</w:t>
+        <w:t>Рисунок 5 — Результаты тестирования и запуска программы</w:t>
       </w:r>
     </w:p>
     <w:p>
@@ -195,595 +812,15 @@
         <w:pStyle w:val="Heading1"/>
       </w:pPr>
       <w:r>
-        <w:t>1 Цель и состав работы</w:t>
+        <w:t>Результат</w:t>
       </w:r>
     </w:p>
     <w:p>
+      <w:pPr>
+        <w:jc w:val="both"/>
+      </w:pPr>
       <w:r>
-        <w:rPr>
-          <w:b w:val="0"/>
-        </w:rPr>
-        <w:t>Создан публичный репозиторий учебного проекта StudyTasks, организованы задачи и документация, выполнены операции Git и подготовлен работающий прототип. Три интеграционных теста завершились успешно. Основные требования вложения контрольной реализованы; парное ревью из дополнительной актуальной методички ожидает другого участника.</w:t>
-      </w:r>
-    </w:p>
-    <w:p>
-      <w:r>
-        <w:rPr>
-          <w:b w:val="0"/>
-        </w:rPr>
-        <w:t>Основание: вложение «Практическая работа №1-2.docx» к контрольной №1 в СДО и методички практических работ №1 и №2 за 2026/2027 учебный год. Работа выполнена 11 сентября 2026 года.</w:t>
-      </w:r>
-    </w:p>
-    <w:tbl>
-      <w:tblPr>
-        <w:tblW w:type="auto" w:w="0"/>
-        <w:tblLayout w:type="fixed"/>
-        <w:tblLook w:firstColumn="1" w:firstRow="1" w:lastColumn="0" w:lastRow="0" w:noHBand="0" w:noVBand="1" w:val="04A0"/>
-      </w:tblPr>
-      <w:tblGrid>
-        <w:gridCol w:w="4649"/>
-        <w:gridCol w:w="4989"/>
-      </w:tblGrid>
-      <w:tr>
-        <w:trPr>
-          <w:cantSplit/>
-          <w:tblHeader/>
-        </w:trPr>
-        <w:tc>
-          <w:tcPr>
-            <w:tcW w:type="dxa" w:w="4649"/>
-            <w:tcBorders>
-              <w:top w:val="single" w:sz="4" w:color="D9D9D9"/>
-              <w:left w:val="single" w:sz="4" w:color="D9D9D9"/>
-              <w:bottom w:val="single" w:sz="4" w:color="D9D9D9"/>
-              <w:right w:val="single" w:sz="4" w:color="D9D9D9"/>
-            </w:tcBorders>
-            <w:shd w:fill="E7EDF3"/>
-          </w:tcPr>
-          <w:p>
-            <w:pPr>
-              <w:spacing w:after="80" w:before="80"/>
-              <w:ind w:firstLine="0"/>
-            </w:pPr>
-            <w:r>
-              <w:rPr>
-                <w:b/>
-                <w:sz w:val="20"/>
-              </w:rPr>
-              <w:t>Требование вложения контрольной</w:t>
-            </w:r>
-          </w:p>
-        </w:tc>
-        <w:tc>
-          <w:tcPr>
-            <w:tcW w:type="dxa" w:w="4989"/>
-            <w:tcBorders>
-              <w:top w:val="single" w:sz="4" w:color="D9D9D9"/>
-              <w:left w:val="single" w:sz="4" w:color="D9D9D9"/>
-              <w:bottom w:val="single" w:sz="4" w:color="D9D9D9"/>
-              <w:right w:val="single" w:sz="4" w:color="D9D9D9"/>
-            </w:tcBorders>
-            <w:shd w:fill="E7EDF3"/>
-          </w:tcPr>
-          <w:p>
-            <w:pPr>
-              <w:spacing w:after="80" w:before="80"/>
-              <w:ind w:firstLine="0"/>
-            </w:pPr>
-            <w:r>
-              <w:rPr>
-                <w:b/>
-                <w:sz w:val="20"/>
-              </w:rPr>
-              <w:t>Результат</w:t>
-            </w:r>
-          </w:p>
-        </w:tc>
-      </w:tr>
-      <w:tr>
-        <w:trPr>
-          <w:cantSplit/>
-        </w:trPr>
-        <w:tc>
-          <w:tcPr>
-            <w:tcW w:type="dxa" w:w="4649"/>
-            <w:tcBorders>
-              <w:top w:val="single" w:sz="4" w:color="D9D9D9"/>
-              <w:left w:val="single" w:sz="4" w:color="D9D9D9"/>
-              <w:bottom w:val="single" w:sz="4" w:color="D9D9D9"/>
-              <w:right w:val="single" w:sz="4" w:color="D9D9D9"/>
-            </w:tcBorders>
-          </w:tcPr>
-          <w:p>
-            <w:pPr>
-              <w:spacing w:after="80" w:before="80"/>
-              <w:ind w:firstLine="0"/>
-            </w:pPr>
-            <w:r>
-              <w:rPr>
-                <w:b w:val="0"/>
-                <w:sz w:val="20"/>
-              </w:rPr>
-              <w:t>Публичный удалённый репозиторий</w:t>
-            </w:r>
-          </w:p>
-        </w:tc>
-        <w:tc>
-          <w:tcPr>
-            <w:tcW w:type="dxa" w:w="4989"/>
-            <w:tcBorders>
-              <w:top w:val="single" w:sz="4" w:color="D9D9D9"/>
-              <w:left w:val="single" w:sz="4" w:color="D9D9D9"/>
-              <w:bottom w:val="single" w:sz="4" w:color="D9D9D9"/>
-              <w:right w:val="single" w:sz="4" w:color="D9D9D9"/>
-            </w:tcBorders>
-          </w:tcPr>
-          <w:p>
-            <w:pPr>
-              <w:spacing w:after="80" w:before="80"/>
-              <w:ind w:firstLine="0"/>
-            </w:pPr>
-            <w:r>
-              <w:rPr>
-                <w:b w:val="0"/>
-                <w:sz w:val="20"/>
-              </w:rPr>
-              <w:t>blur3773/devops-course-2026, Public</w:t>
-            </w:r>
-          </w:p>
-        </w:tc>
-      </w:tr>
-      <w:tr>
-        <w:trPr>
-          <w:cantSplit/>
-        </w:trPr>
-        <w:tc>
-          <w:tcPr>
-            <w:tcW w:type="dxa" w:w="4649"/>
-            <w:tcBorders>
-              <w:top w:val="single" w:sz="4" w:color="D9D9D9"/>
-              <w:left w:val="single" w:sz="4" w:color="D9D9D9"/>
-              <w:bottom w:val="single" w:sz="4" w:color="D9D9D9"/>
-              <w:right w:val="single" w:sz="4" w:color="D9D9D9"/>
-            </w:tcBorders>
-          </w:tcPr>
-          <w:p>
-            <w:pPr>
-              <w:spacing w:after="80" w:before="80"/>
-              <w:ind w:firstLine="0"/>
-            </w:pPr>
-            <w:r>
-              <w:rPr>
-                <w:b w:val="0"/>
-                <w:sz w:val="20"/>
-              </w:rPr>
-              <w:t>Доска или список задач</w:t>
-            </w:r>
-          </w:p>
-        </w:tc>
-        <w:tc>
-          <w:tcPr>
-            <w:tcW w:type="dxa" w:w="4989"/>
-            <w:tcBorders>
-              <w:top w:val="single" w:sz="4" w:color="D9D9D9"/>
-              <w:left w:val="single" w:sz="4" w:color="D9D9D9"/>
-              <w:bottom w:val="single" w:sz="4" w:color="D9D9D9"/>
-              <w:right w:val="single" w:sz="4" w:color="D9D9D9"/>
-            </w:tcBorders>
-          </w:tcPr>
-          <w:p>
-            <w:pPr>
-              <w:spacing w:after="80" w:before="80"/>
-              <w:ind w:firstLine="0"/>
-            </w:pPr>
-            <w:r>
-              <w:rPr>
-                <w:b w:val="0"/>
-                <w:sz w:val="20"/>
-              </w:rPr>
-              <w:t>TASKS.md с четырьмя состояниями</w:t>
-            </w:r>
-          </w:p>
-        </w:tc>
-      </w:tr>
-      <w:tr>
-        <w:trPr>
-          <w:cantSplit/>
-        </w:trPr>
-        <w:tc>
-          <w:tcPr>
-            <w:tcW w:type="dxa" w:w="4649"/>
-            <w:tcBorders>
-              <w:top w:val="single" w:sz="4" w:color="D9D9D9"/>
-              <w:left w:val="single" w:sz="4" w:color="D9D9D9"/>
-              <w:bottom w:val="single" w:sz="4" w:color="D9D9D9"/>
-              <w:right w:val="single" w:sz="4" w:color="D9D9D9"/>
-            </w:tcBorders>
-          </w:tcPr>
-          <w:p>
-            <w:pPr>
-              <w:spacing w:after="80" w:before="80"/>
-              <w:ind w:firstLine="0"/>
-            </w:pPr>
-            <w:r>
-              <w:rPr>
-                <w:b w:val="0"/>
-                <w:sz w:val="20"/>
-              </w:rPr>
-              <w:t>Создание задач</w:t>
-            </w:r>
-          </w:p>
-        </w:tc>
-        <w:tc>
-          <w:tcPr>
-            <w:tcW w:type="dxa" w:w="4989"/>
-            <w:tcBorders>
-              <w:top w:val="single" w:sz="4" w:color="D9D9D9"/>
-              <w:left w:val="single" w:sz="4" w:color="D9D9D9"/>
-              <w:bottom w:val="single" w:sz="4" w:color="D9D9D9"/>
-              <w:right w:val="single" w:sz="4" w:color="D9D9D9"/>
-            </w:tcBorders>
-          </w:tcPr>
-          <w:p>
-            <w:pPr>
-              <w:spacing w:after="80" w:before="80"/>
-              <w:ind w:firstLine="0"/>
-            </w:pPr>
-            <w:r>
-              <w:rPr>
-                <w:b w:val="0"/>
-                <w:sz w:val="20"/>
-              </w:rPr>
-              <w:t>Пять задач GitHub Issues №1–5</w:t>
-            </w:r>
-          </w:p>
-        </w:tc>
-      </w:tr>
-      <w:tr>
-        <w:trPr>
-          <w:cantSplit/>
-        </w:trPr>
-        <w:tc>
-          <w:tcPr>
-            <w:tcW w:type="dxa" w:w="4649"/>
-            <w:tcBorders>
-              <w:top w:val="single" w:sz="4" w:color="D9D9D9"/>
-              <w:left w:val="single" w:sz="4" w:color="D9D9D9"/>
-              <w:bottom w:val="single" w:sz="4" w:color="D9D9D9"/>
-              <w:right w:val="single" w:sz="4" w:color="D9D9D9"/>
-            </w:tcBorders>
-          </w:tcPr>
-          <w:p>
-            <w:pPr>
-              <w:spacing w:after="80" w:before="80"/>
-              <w:ind w:firstLine="0"/>
-            </w:pPr>
-            <w:r>
-              <w:rPr>
-                <w:b w:val="0"/>
-                <w:sz w:val="20"/>
-              </w:rPr>
-              <w:t>Раздел документации</w:t>
-            </w:r>
-          </w:p>
-        </w:tc>
-        <w:tc>
-          <w:tcPr>
-            <w:tcW w:type="dxa" w:w="4989"/>
-            <w:tcBorders>
-              <w:top w:val="single" w:sz="4" w:color="D9D9D9"/>
-              <w:left w:val="single" w:sz="4" w:color="D9D9D9"/>
-              <w:bottom w:val="single" w:sz="4" w:color="D9D9D9"/>
-              <w:right w:val="single" w:sz="4" w:color="D9D9D9"/>
-            </w:tcBorders>
-          </w:tcPr>
-          <w:p>
-            <w:pPr>
-              <w:spacing w:after="80" w:before="80"/>
-              <w:ind w:firstLine="0"/>
-            </w:pPr>
-            <w:r>
-              <w:rPr>
-                <w:b w:val="0"/>
-                <w:sz w:val="20"/>
-              </w:rPr>
-              <w:t>docs/README.md и связанные материалы</w:t>
-            </w:r>
-          </w:p>
-        </w:tc>
-      </w:tr>
-      <w:tr>
-        <w:trPr>
-          <w:cantSplit/>
-        </w:trPr>
-        <w:tc>
-          <w:tcPr>
-            <w:tcW w:type="dxa" w:w="4649"/>
-            <w:tcBorders>
-              <w:top w:val="single" w:sz="4" w:color="D9D9D9"/>
-              <w:left w:val="single" w:sz="4" w:color="D9D9D9"/>
-              <w:bottom w:val="single" w:sz="4" w:color="D9D9D9"/>
-              <w:right w:val="single" w:sz="4" w:color="D9D9D9"/>
-            </w:tcBorders>
-          </w:tcPr>
-          <w:p>
-            <w:pPr>
-              <w:spacing w:after="80" w:before="80"/>
-              <w:ind w:firstLine="0"/>
-            </w:pPr>
-            <w:r>
-              <w:rPr>
-                <w:b w:val="0"/>
-                <w:sz w:val="20"/>
-              </w:rPr>
-              <w:t>Локальный Git-репозиторий</w:t>
-            </w:r>
-          </w:p>
-        </w:tc>
-        <w:tc>
-          <w:tcPr>
-            <w:tcW w:type="dxa" w:w="4989"/>
-            <w:tcBorders>
-              <w:top w:val="single" w:sz="4" w:color="D9D9D9"/>
-              <w:left w:val="single" w:sz="4" w:color="D9D9D9"/>
-              <w:bottom w:val="single" w:sz="4" w:color="D9D9D9"/>
-              <w:right w:val="single" w:sz="4" w:color="D9D9D9"/>
-            </w:tcBorders>
-          </w:tcPr>
-          <w:p>
-            <w:pPr>
-              <w:spacing w:after="80" w:before="80"/>
-              <w:ind w:firstLine="0"/>
-            </w:pPr>
-            <w:r>
-              <w:rPr>
-                <w:b w:val="0"/>
-                <w:sz w:val="20"/>
-              </w:rPr>
-              <w:t>Создан клонированием GitHub-репозитория</w:t>
-            </w:r>
-          </w:p>
-        </w:tc>
-      </w:tr>
-      <w:tr>
-        <w:trPr>
-          <w:cantSplit/>
-        </w:trPr>
-        <w:tc>
-          <w:tcPr>
-            <w:tcW w:type="dxa" w:w="4649"/>
-            <w:tcBorders>
-              <w:top w:val="single" w:sz="4" w:color="D9D9D9"/>
-              <w:left w:val="single" w:sz="4" w:color="D9D9D9"/>
-              <w:bottom w:val="single" w:sz="4" w:color="D9D9D9"/>
-              <w:right w:val="single" w:sz="4" w:color="D9D9D9"/>
-            </w:tcBorders>
-          </w:tcPr>
-          <w:p>
-            <w:pPr>
-              <w:spacing w:after="80" w:before="80"/>
-              <w:ind w:firstLine="0"/>
-            </w:pPr>
-            <w:r>
-              <w:rPr>
-                <w:b w:val="0"/>
-                <w:sz w:val="20"/>
-              </w:rPr>
-              <w:t>Связь с удалённым репозиторием</w:t>
-            </w:r>
-          </w:p>
-        </w:tc>
-        <w:tc>
-          <w:tcPr>
-            <w:tcW w:type="dxa" w:w="4989"/>
-            <w:tcBorders>
-              <w:top w:val="single" w:sz="4" w:color="D9D9D9"/>
-              <w:left w:val="single" w:sz="4" w:color="D9D9D9"/>
-              <w:bottom w:val="single" w:sz="4" w:color="D9D9D9"/>
-              <w:right w:val="single" w:sz="4" w:color="D9D9D9"/>
-            </w:tcBorders>
-          </w:tcPr>
-          <w:p>
-            <w:pPr>
-              <w:spacing w:after="80" w:before="80"/>
-              <w:ind w:firstLine="0"/>
-            </w:pPr>
-            <w:r>
-              <w:rPr>
-                <w:b w:val="0"/>
-                <w:sz w:val="20"/>
-              </w:rPr>
-              <w:t>origin, SSH-аутентификация через порт 443</w:t>
-            </w:r>
-          </w:p>
-        </w:tc>
-      </w:tr>
-      <w:tr>
-        <w:trPr>
-          <w:cantSplit/>
-        </w:trPr>
-        <w:tc>
-          <w:tcPr>
-            <w:tcW w:type="dxa" w:w="4649"/>
-            <w:tcBorders>
-              <w:top w:val="single" w:sz="4" w:color="D9D9D9"/>
-              <w:left w:val="single" w:sz="4" w:color="D9D9D9"/>
-              <w:bottom w:val="single" w:sz="4" w:color="D9D9D9"/>
-              <w:right w:val="single" w:sz="4" w:color="D9D9D9"/>
-            </w:tcBorders>
-          </w:tcPr>
-          <w:p>
-            <w:pPr>
-              <w:spacing w:after="80" w:before="80"/>
-              <w:ind w:firstLine="0"/>
-            </w:pPr>
-            <w:r>
-              <w:rPr>
-                <w:b w:val="0"/>
-                <w:sz w:val="20"/>
-              </w:rPr>
-              <w:t>Основные файлы проекта</w:t>
-            </w:r>
-          </w:p>
-        </w:tc>
-        <w:tc>
-          <w:tcPr>
-            <w:tcW w:type="dxa" w:w="4989"/>
-            <w:tcBorders>
-              <w:top w:val="single" w:sz="4" w:color="D9D9D9"/>
-              <w:left w:val="single" w:sz="4" w:color="D9D9D9"/>
-              <w:bottom w:val="single" w:sz="4" w:color="D9D9D9"/>
-              <w:right w:val="single" w:sz="4" w:color="D9D9D9"/>
-            </w:tcBorders>
-          </w:tcPr>
-          <w:p>
-            <w:pPr>
-              <w:spacing w:after="80" w:before="80"/>
-              <w:ind w:firstLine="0"/>
-            </w:pPr>
-            <w:r>
-              <w:rPr>
-                <w:b w:val="0"/>
-                <w:sz w:val="20"/>
-              </w:rPr>
-              <w:t>src, tests, docs, README.md, .gitignore</w:t>
-            </w:r>
-          </w:p>
-        </w:tc>
-      </w:tr>
-      <w:tr>
-        <w:trPr>
-          <w:cantSplit/>
-        </w:trPr>
-        <w:tc>
-          <w:tcPr>
-            <w:tcW w:type="dxa" w:w="4649"/>
-            <w:tcBorders>
-              <w:top w:val="single" w:sz="4" w:color="D9D9D9"/>
-              <w:left w:val="single" w:sz="4" w:color="D9D9D9"/>
-              <w:bottom w:val="single" w:sz="4" w:color="D9D9D9"/>
-              <w:right w:val="single" w:sz="4" w:color="D9D9D9"/>
-            </w:tcBorders>
-          </w:tcPr>
-          <w:p>
-            <w:pPr>
-              <w:spacing w:after="80" w:before="80"/>
-              <w:ind w:firstLine="0"/>
-            </w:pPr>
-            <w:r>
-              <w:rPr>
-                <w:b w:val="0"/>
-                <w:sz w:val="20"/>
-              </w:rPr>
-              <w:t>Отправка изменений</w:t>
-            </w:r>
-          </w:p>
-        </w:tc>
-        <w:tc>
-          <w:tcPr>
-            <w:tcW w:type="dxa" w:w="4989"/>
-            <w:tcBorders>
-              <w:top w:val="single" w:sz="4" w:color="D9D9D9"/>
-              <w:left w:val="single" w:sz="4" w:color="D9D9D9"/>
-              <w:bottom w:val="single" w:sz="4" w:color="D9D9D9"/>
-              <w:right w:val="single" w:sz="4" w:color="D9D9D9"/>
-            </w:tcBorders>
-          </w:tcPr>
-          <w:p>
-            <w:pPr>
-              <w:spacing w:after="80" w:before="80"/>
-              <w:ind w:firstLine="0"/>
-            </w:pPr>
-            <w:r>
-              <w:rPr>
-                <w:b w:val="0"/>
-                <w:sz w:val="20"/>
-              </w:rPr>
-              <w:t>Push и squash merge PR №6 и №8</w:t>
-            </w:r>
-          </w:p>
-        </w:tc>
-      </w:tr>
-      <w:tr>
-        <w:trPr>
-          <w:cantSplit/>
-        </w:trPr>
-        <w:tc>
-          <w:tcPr>
-            <w:tcW w:type="dxa" w:w="4649"/>
-            <w:tcBorders>
-              <w:top w:val="single" w:sz="4" w:color="D9D9D9"/>
-              <w:left w:val="single" w:sz="4" w:color="D9D9D9"/>
-              <w:bottom w:val="single" w:sz="4" w:color="D9D9D9"/>
-              <w:right w:val="single" w:sz="4" w:color="D9D9D9"/>
-            </w:tcBorders>
-          </w:tcPr>
-          <w:p>
-            <w:pPr>
-              <w:spacing w:after="80" w:before="80"/>
-              <w:ind w:firstLine="0"/>
-            </w:pPr>
-            <w:r>
-              <w:rPr>
-                <w:b w:val="0"/>
-                <w:sz w:val="20"/>
-              </w:rPr>
-              <w:t>Отчёт Word со скриншотами и ссылкой</w:t>
-            </w:r>
-          </w:p>
-        </w:tc>
-        <w:tc>
-          <w:tcPr>
-            <w:tcW w:type="dxa" w:w="4989"/>
-            <w:tcBorders>
-              <w:top w:val="single" w:sz="4" w:color="D9D9D9"/>
-              <w:left w:val="single" w:sz="4" w:color="D9D9D9"/>
-              <w:bottom w:val="single" w:sz="4" w:color="D9D9D9"/>
-              <w:right w:val="single" w:sz="4" w:color="D9D9D9"/>
-            </w:tcBorders>
-          </w:tcPr>
-          <w:p>
-            <w:pPr>
-              <w:spacing w:after="80" w:before="80"/>
-              <w:ind w:firstLine="0"/>
-            </w:pPr>
-            <w:r>
-              <w:rPr>
-                <w:b w:val="0"/>
-                <w:sz w:val="20"/>
-              </w:rPr>
-              <w:t>Настоящий документ и reports/screenshots</w:t>
-            </w:r>
-          </w:p>
-        </w:tc>
-      </w:tr>
-    </w:tbl>
-    <w:p>
-      <w:r>
-        <w:rPr>
-          <w:b w:val="0"/>
-        </w:rPr>
-      </w:r>
-    </w:p>
-    <w:p>
-      <w:r>
-        <w:rPr>
-          <w:b/>
-        </w:rPr>
-        <w:t>Репозиторий: https://github.com/blur3773/devops-course-2026</w:t>
-      </w:r>
-    </w:p>
-    <w:p>
-      <w:r>
-        <w:rPr>
-          <w:b w:val="0"/>
-        </w:rPr>
-        <w:t>StudyTasks хранит учебные задачи в JSON, показывает список и отмечает выполненные пункты. Используются Python 3.10+ и стандартная библиотека; внешние зависимости не требуются.</w:t>
-      </w:r>
-    </w:p>
-    <w:p>
-      <w:r>
-        <w:br w:type="page"/>
+        <w:t>Создан и опубликован проект с исходным кодом, документацией и тестами. Локальный репозиторий связан с удалённым, изменения отправлены в GitHub. Задачи зарегистрированы в Issues и представлены в TASKS.md. Проверки прошли успешно.</w:t>
       </w:r>
     </w:p>
     <w:p>
@@ -791,80 +828,25 @@
         <w:pStyle w:val="Heading1"/>
       </w:pPr>
       <w:r>
-        <w:t>2 Публичный репозиторий и структура</w:t>
-      </w:r>
-    </w:p>
-    <w:p>
-      <w:r>
-        <w:rPr>
-          <w:b w:val="0"/>
-        </w:rPr>
-        <w:t>В аккаунте blur3773 создан репозиторий devops-course-2026 с видимостью Public и начальным README.md. Затем опубликованы профиль студента, цели семестра, исходный код, тесты и документация. Проверка страницы без входа в GitHub подтверждает публичную доступность.</w:t>
+        <w:t>Ссылки</w:t>
       </w:r>
     </w:p>
     <w:p>
       <w:pPr>
-        <w:keepNext/>
-        <w:ind w:firstLine="0"/>
-        <w:jc w:val="center"/>
+        <w:pStyle w:val="ListBullet"/>
+        <w:spacing w:after="60"/>
       </w:pPr>
       <w:r>
-        <w:drawing>
-          <wp:inline xmlns:a="http://schemas.openxmlformats.org/drawingml/2006/main" xmlns:pic="http://schemas.openxmlformats.org/drawingml/2006/picture">
-            <wp:extent cx="5680059" cy="6227999"/>
-            <wp:docPr id="1" name="Picture 1"/>
-            <wp:cNvGraphicFramePr>
-              <a:graphicFrameLocks noChangeAspect="1"/>
-            </wp:cNvGraphicFramePr>
-            <a:graphic>
-              <a:graphicData uri="http://schemas.openxmlformats.org/drawingml/2006/picture">
-                <pic:pic>
-                  <pic:nvPicPr>
-                    <pic:cNvPr id="0" name="02-repository-files.png"/>
-                    <pic:cNvPicPr/>
-                  </pic:nvPicPr>
-                  <pic:blipFill>
-                    <a:blip r:embed="rId10"/>
-                    <a:stretch>
-                      <a:fillRect/>
-                    </a:stretch>
-                  </pic:blipFill>
-                  <pic:spPr>
-                    <a:xfrm>
-                      <a:off x="0" y="0"/>
-                      <a:ext cx="5680059" cy="6227999"/>
-                    </a:xfrm>
-                    <a:prstGeom prst="rect"/>
-                  </pic:spPr>
-                </pic:pic>
-              </a:graphicData>
-            </a:graphic>
-          </wp:inline>
-        </w:drawing>
+        <w:t>Репозиторий: https://github.com/blur3773/devops-course-2026</w:t>
       </w:r>
     </w:p>
     <w:p>
       <w:pPr>
-        <w:pStyle w:val="Caption"/>
-        <w:ind w:firstLine="0"/>
-        <w:jc w:val="center"/>
+        <w:pStyle w:val="ListBullet"/>
+        <w:spacing w:after="60"/>
       </w:pPr>
       <w:r>
-        <w:t>Рисунок 1 — Публичный репозиторий и опубликованные файлы</w:t>
-      </w:r>
-    </w:p>
-    <w:p>
-      <w:r>
-        <w:rPr>
-          <w:b w:val="0"/>
-          <w:sz w:val="22"/>
-        </w:rPr>
-        <w:t>Структура: src/ — программа; tests/ — тесты; docs/ — документация; reports/ — отчёт и подтверждения. Локальное хранилище data/ и служебные файлы исключены через .gitignore.</w:t>
-      </w:r>
-    </w:p>
-    <w:p>
-      <w:r>
-        <w:br w:type="page"/>
+        <w:t>Список задач: https://github.com/blur3773/devops-course-2026/blob/main/TASKS.md</w:t>
       </w:r>
     </w:p>
     <w:p>
@@ -872,1509 +854,22 @@
         <w:pStyle w:val="Heading1"/>
       </w:pPr>
       <w:r>
-        <w:t>3 Организация задач проекта</w:t>
-      </w:r>
-    </w:p>
-    <w:p>
-      <w:r>
-        <w:rPr>
-          <w:b w:val="0"/>
-        </w:rPr>
-        <w:t>Созданы пять GitHub Issues с описаниями и критериями готовности. В TASKS.md задачи распределены по состояниям «Запланировано», «В работе», «Ожидает внешнего ревью» и «Выполнено». Такой список прямо допускается методичкой как альтернатива GitHub Projects.</w:t>
+        <w:t>Вывод</w:t>
       </w:r>
     </w:p>
     <w:p>
       <w:pPr>
-        <w:keepNext/>
-        <w:ind w:firstLine="0"/>
-        <w:jc w:val="center"/>
+        <w:jc w:val="both"/>
       </w:pPr>
       <w:r>
-        <w:drawing>
-          <wp:inline xmlns:a="http://schemas.openxmlformats.org/drawingml/2006/main" xmlns:pic="http://schemas.openxmlformats.org/drawingml/2006/picture">
-            <wp:extent cx="5680059" cy="6227999"/>
-            <wp:docPr id="2" name="Picture 2"/>
-            <wp:cNvGraphicFramePr>
-              <a:graphicFrameLocks noChangeAspect="1"/>
-            </wp:cNvGraphicFramePr>
-            <a:graphic>
-              <a:graphicData uri="http://schemas.openxmlformats.org/drawingml/2006/picture">
-                <pic:pic>
-                  <pic:nvPicPr>
-                    <pic:cNvPr id="0" name="03-task-board.png"/>
-                    <pic:cNvPicPr/>
-                  </pic:nvPicPr>
-                  <pic:blipFill>
-                    <a:blip r:embed="rId11"/>
-                    <a:stretch>
-                      <a:fillRect/>
-                    </a:stretch>
-                  </pic:blipFill>
-                  <pic:spPr>
-                    <a:xfrm>
-                      <a:off x="0" y="0"/>
-                      <a:ext cx="5680059" cy="6227999"/>
-                    </a:xfrm>
-                    <a:prstGeom prst="rect"/>
-                  </pic:spPr>
-                </pic:pic>
-              </a:graphicData>
-            </a:graphic>
-          </wp:inline>
-        </w:drawing>
-      </w:r>
-    </w:p>
-    <w:p>
-      <w:pPr>
-        <w:pStyle w:val="Caption"/>
-        <w:ind w:firstLine="0"/>
-        <w:jc w:val="center"/>
-      </w:pPr>
-      <w:r>
-        <w:t>Рисунок 2 — Список задач проекта со ссылками на GitHub Issues</w:t>
-      </w:r>
-    </w:p>
-    <w:p>
-      <w:r>
-        <w:rPr>
-          <w:b w:val="0"/>
-          <w:sz w:val="22"/>
-        </w:rPr>
-        <w:t>Снимок сделан во время подготовки отчёта. После публикации документа задача №3 закрывается. Дедлайны и контейнеризация относятся к дальнейшему развитию; они не представлены как уже реализованные возможности.</w:t>
-      </w:r>
-    </w:p>
-    <w:p>
-      <w:r>
-        <w:br w:type="page"/>
-      </w:r>
-    </w:p>
-    <w:p>
-      <w:pPr>
-        <w:pStyle w:val="Heading1"/>
-      </w:pPr>
-      <w:r>
-        <w:t>4 Документация и основные файлы</w:t>
-      </w:r>
-    </w:p>
-    <w:p>
-      <w:r>
-        <w:rPr>
-          <w:b w:val="0"/>
-        </w:rPr>
-        <w:t>В docs/README.md описаны назначение StudyTasks, пользовательские сценарии, структура, запуск, критерии готовности и ограничения. Главный README.md связывает документацию, задачи и учебные материалы. Документация версионируется вместе с кодом.</w:t>
-      </w:r>
-    </w:p>
-    <w:p>
-      <w:pPr>
-        <w:keepNext/>
-        <w:ind w:firstLine="0"/>
-        <w:jc w:val="center"/>
-      </w:pPr>
-      <w:r>
-        <w:drawing>
-          <wp:inline xmlns:a="http://schemas.openxmlformats.org/drawingml/2006/main" xmlns:pic="http://schemas.openxmlformats.org/drawingml/2006/picture">
-            <wp:extent cx="5483063" cy="6012000"/>
-            <wp:docPr id="3" name="Picture 3"/>
-            <wp:cNvGraphicFramePr>
-              <a:graphicFrameLocks noChangeAspect="1"/>
-            </wp:cNvGraphicFramePr>
-            <a:graphic>
-              <a:graphicData uri="http://schemas.openxmlformats.org/drawingml/2006/picture">
-                <pic:pic>
-                  <pic:nvPicPr>
-                    <pic:cNvPr id="0" name="05-documentation.png"/>
-                    <pic:cNvPicPr/>
-                  </pic:nvPicPr>
-                  <pic:blipFill>
-                    <a:blip r:embed="rId12"/>
-                    <a:stretch>
-                      <a:fillRect/>
-                    </a:stretch>
-                  </pic:blipFill>
-                  <pic:spPr>
-                    <a:xfrm>
-                      <a:off x="0" y="0"/>
-                      <a:ext cx="5483063" cy="6012000"/>
-                    </a:xfrm>
-                    <a:prstGeom prst="rect"/>
-                  </pic:spPr>
-                </pic:pic>
-              </a:graphicData>
-            </a:graphic>
-          </wp:inline>
-        </w:drawing>
-      </w:r>
-    </w:p>
-    <w:p>
-      <w:pPr>
-        <w:pStyle w:val="Caption"/>
-        <w:ind w:firstLine="0"/>
-        <w:jc w:val="center"/>
-      </w:pPr>
-      <w:r>
-        <w:t>Рисунок 3 — Документация проекта на GitHub</w:t>
-      </w:r>
-    </w:p>
-    <w:p>
-      <w:r>
-        <w:rPr>
-          <w:b w:val="0"/>
-          <w:sz w:val="22"/>
-        </w:rPr>
-        <w:t>Дополнительные файлы: about_me.md — ФИО, группа и технологии; goals.md — три цели на семестр; svn_comparison.md — ответы по SVN; docs/self-check.md — ответы на контрольные вопросы.</w:t>
-      </w:r>
-    </w:p>
-    <w:p>
-      <w:r>
-        <w:br w:type="page"/>
-      </w:r>
-    </w:p>
-    <w:p>
-      <w:pPr>
-        <w:pStyle w:val="Heading1"/>
-      </w:pPr>
-      <w:r>
-        <w:t>5 Локальный Git и SSH</w:t>
-      </w:r>
-    </w:p>
-    <w:p>
-      <w:r>
-        <w:rPr>
-          <w:b w:val="0"/>
-        </w:rPr>
-        <w:t>Git версии 2.50.1 уже установлен. Репозиторий клонирован по SSH. В локальной конфигурации указаны ФИО автора и GitHub noreply-адрес. Имеющийся SSH-ключ успешно прошёл проверку GitHub; новый ключ не создавался. При недоступном порте 22 использован ssh.github.com:443 с проверкой известного ключа узла github.com.</w:t>
-      </w:r>
-    </w:p>
-    <w:p>
-      <w:pPr>
-        <w:spacing w:after="140" w:line="240" w:lineRule="auto"/>
-        <w:ind w:firstLine="0"/>
-      </w:pPr>
-      <w:r>
-        <w:rPr>
-          <w:rFonts w:ascii="Consolas" w:hAnsi="Consolas"/>
-          <w:sz w:val="18"/>
-        </w:rPr>
-        <w:t>git clone git@github.com:blur3773/devops-course-2026.git</w:t>
-        <w:br/>
-        <w:t>git config user.name "Изосимов Максим Игоревич"</w:t>
-        <w:br/>
-        <w:t>git config user.email "232448489+blur3773@users.noreply.github.com"</w:t>
-        <w:br/>
-        <w:t>git remote -v</w:t>
-        <w:br/>
-        <w:t>ssh -o HostKeyAlias=github.com -p 443 -T git@ssh.github.com</w:t>
-      </w:r>
-    </w:p>
-    <w:p>
-      <w:r>
-        <w:rPr>
-          <w:b w:val="0"/>
-          <w:sz w:val="22"/>
-        </w:rPr>
-        <w:t>При клонировании также задан GIT_SSH_COMMAND с портом 443; затем тот же транспорт сохранён в локальном core.sshCommand. Клонирование создало каталог .git и связь origin, поэтому повторный git init не требовался.</w:t>
-      </w:r>
-    </w:p>
-    <w:p>
-      <w:pPr>
-        <w:keepNext/>
-        <w:ind w:firstLine="0"/>
-        <w:jc w:val="center"/>
-      </w:pPr>
-      <w:r>
-        <w:drawing>
-          <wp:inline xmlns:a="http://schemas.openxmlformats.org/drawingml/2006/main" xmlns:pic="http://schemas.openxmlformats.org/drawingml/2006/picture">
-            <wp:extent cx="6048000" cy="3680558"/>
-            <wp:docPr id="4" name="Picture 4"/>
-            <wp:cNvGraphicFramePr>
-              <a:graphicFrameLocks noChangeAspect="1"/>
-            </wp:cNvGraphicFramePr>
-            <a:graphic>
-              <a:graphicData uri="http://schemas.openxmlformats.org/drawingml/2006/picture">
-                <pic:pic>
-                  <pic:nvPicPr>
-                    <pic:cNvPr id="0" name="06-git-and-ssh.png"/>
-                    <pic:cNvPicPr/>
-                  </pic:nvPicPr>
-                  <pic:blipFill>
-                    <a:blip r:embed="rId13"/>
-                    <a:stretch>
-                      <a:fillRect/>
-                    </a:stretch>
-                  </pic:blipFill>
-                  <pic:spPr>
-                    <a:xfrm>
-                      <a:off x="0" y="0"/>
-                      <a:ext cx="6048000" cy="3680558"/>
-                    </a:xfrm>
-                    <a:prstGeom prst="rect"/>
-                  </pic:spPr>
-                </pic:pic>
-              </a:graphicData>
-            </a:graphic>
-          </wp:inline>
-        </w:drawing>
-      </w:r>
-    </w:p>
-    <w:p>
-      <w:pPr>
-        <w:pStyle w:val="Caption"/>
-        <w:ind w:firstLine="0"/>
-        <w:jc w:val="center"/>
-      </w:pPr>
-      <w:r>
-        <w:t>Рисунок 4 — Сохранённый фактический вывод Git и SSH в VS Code</w:t>
-      </w:r>
-    </w:p>
-    <w:p>
-      <w:r>
-        <w:rPr>
-          <w:b w:val="0"/>
-          <w:sz w:val="22"/>
-        </w:rPr>
-        <w:t>Журнал reports/evidence/git-before.txt содержит команды, ветки, граф истории и ответ “Hi blur3773! You’ve successfully authenticated…”. Это сохранённый вывод реально выполненных команд; скриншот показывает файл журнала в редакторе.</w:t>
-      </w:r>
-    </w:p>
-    <w:p>
-      <w:r>
-        <w:br w:type="page"/>
-      </w:r>
-    </w:p>
-    <w:p>
-      <w:pPr>
-        <w:pStyle w:val="Heading1"/>
-      </w:pPr>
-      <w:r>
-        <w:t>6 Коммиты и публикация изменений</w:t>
-      </w:r>
-    </w:p>
-    <w:p>
-      <w:r>
-        <w:rPr>
-          <w:b w:val="0"/>
-        </w:rPr>
-        <w:t>Каркас проекта подготовлен в ветке codex/project-infrastructure. Отдельные коммиты сохранили сведения о студенте, исходные файлы и доску задач. После локальных тестов выполнен push и создан PR №6. Ветка объединена с main через Squash and merge; удалённая рабочая ветка удалена.</w:t>
-      </w:r>
-    </w:p>
-    <w:p>
-      <w:pPr>
-        <w:keepNext/>
-        <w:ind w:firstLine="0"/>
-        <w:jc w:val="center"/>
-      </w:pPr>
-      <w:r>
-        <w:drawing>
-          <wp:inline xmlns:a="http://schemas.openxmlformats.org/drawingml/2006/main" xmlns:pic="http://schemas.openxmlformats.org/drawingml/2006/picture">
-            <wp:extent cx="5581561" cy="6120000"/>
-            <wp:docPr id="5" name="Picture 5"/>
-            <wp:cNvGraphicFramePr>
-              <a:graphicFrameLocks noChangeAspect="1"/>
-            </wp:cNvGraphicFramePr>
-            <a:graphic>
-              <a:graphicData uri="http://schemas.openxmlformats.org/drawingml/2006/picture">
-                <pic:pic>
-                  <pic:nvPicPr>
-                    <pic:cNvPr id="0" name="09-merged-pr.png"/>
-                    <pic:cNvPicPr/>
-                  </pic:nvPicPr>
-                  <pic:blipFill>
-                    <a:blip r:embed="rId14"/>
-                    <a:stretch>
-                      <a:fillRect/>
-                    </a:stretch>
-                  </pic:blipFill>
-                  <pic:spPr>
-                    <a:xfrm>
-                      <a:off x="0" y="0"/>
-                      <a:ext cx="5581561" cy="6120000"/>
-                    </a:xfrm>
-                    <a:prstGeom prst="rect"/>
-                  </pic:spPr>
-                </pic:pic>
-              </a:graphicData>
-            </a:graphic>
-          </wp:inline>
-        </w:drawing>
-      </w:r>
-    </w:p>
-    <w:p>
-      <w:pPr>
-        <w:pStyle w:val="Caption"/>
-        <w:ind w:firstLine="0"/>
-        <w:jc w:val="center"/>
-      </w:pPr>
-      <w:r>
-        <w:t>Рисунок 5 — PR №6 со статусом Merged</w:t>
-      </w:r>
-    </w:p>
-    <w:p>
-      <w:r>
-        <w:rPr>
-          <w:b w:val="0"/>
-          <w:sz w:val="22"/>
-        </w:rPr>
-        <w:t>Ссылка: https://github.com/blur3773/devops-course-2026/pull/6. Итоговый коммит инфраструктуры: e7b86ca. Заметки IDE/CLI и журналы опубликованы отдельным PR №8, также объединённым через squash.</w:t>
-      </w:r>
-    </w:p>
-    <w:p>
-      <w:r>
-        <w:br w:type="page"/>
-      </w:r>
-    </w:p>
-    <w:p>
-      <w:pPr>
-        <w:pStyle w:val="Heading1"/>
-      </w:pPr>
-      <w:r>
-        <w:t>7 Ветвление и учебный Pull Request</w:t>
-      </w:r>
-    </w:p>
-    <w:p>
-      <w:r>
-        <w:rPr>
-          <w:b w:val="0"/>
-        </w:rPr>
-        <w:t>От main создана ветка feature/hobby-project. В hobby.md описаны идея, стек и цель StudyTasks. Выполнен коммит feat: add hobby project description и push -u origin feature/hobby-project. Создан PR №7; следующий коммит добавил критерий готовности через интерфейс VS Code.</w:t>
-      </w:r>
-    </w:p>
-    <w:p>
-      <w:pPr>
-        <w:keepNext/>
-        <w:ind w:firstLine="0"/>
-        <w:jc w:val="center"/>
-      </w:pPr>
-      <w:r>
-        <w:drawing>
-          <wp:inline xmlns:a="http://schemas.openxmlformats.org/drawingml/2006/main" xmlns:pic="http://schemas.openxmlformats.org/drawingml/2006/picture">
-            <wp:extent cx="5253234" cy="5760000"/>
-            <wp:docPr id="6" name="Picture 6"/>
-            <wp:cNvGraphicFramePr>
-              <a:graphicFrameLocks noChangeAspect="1"/>
-            </wp:cNvGraphicFramePr>
-            <a:graphic>
-              <a:graphicData uri="http://schemas.openxmlformats.org/drawingml/2006/picture">
-                <pic:pic>
-                  <pic:nvPicPr>
-                    <pic:cNvPr id="0" name="08-hobby-pr.png"/>
-                    <pic:cNvPicPr/>
-                  </pic:nvPicPr>
-                  <pic:blipFill>
-                    <a:blip r:embed="rId15"/>
-                    <a:stretch>
-                      <a:fillRect/>
-                    </a:stretch>
-                  </pic:blipFill>
-                  <pic:spPr>
-                    <a:xfrm>
-                      <a:off x="0" y="0"/>
-                      <a:ext cx="5253234" cy="5760000"/>
-                    </a:xfrm>
-                    <a:prstGeom prst="rect"/>
-                  </pic:spPr>
-                </pic:pic>
-              </a:graphicData>
-            </a:graphic>
-          </wp:inline>
-        </w:drawing>
-      </w:r>
-    </w:p>
-    <w:p>
-      <w:pPr>
-        <w:pStyle w:val="Caption"/>
-        <w:ind w:firstLine="0"/>
-        <w:jc w:val="center"/>
-      </w:pPr>
-      <w:r>
-        <w:t>Рисунок 6 — Учебный Pull Request с описанием пет-проекта</w:t>
-      </w:r>
-    </w:p>
-    <w:p>
-      <w:r>
-        <w:rPr>
-          <w:b/>
-          <w:sz w:val="22"/>
-        </w:rPr>
-        <w:t>Ссылка: https://github.com/blur3773/devops-course-2026/pull/7. PR оставлен открытым: независимый комментарий и одобрение ещё не получены. После замечания нужно внести исправление, получить одобрение, выполнить squash merge и удалить ветку. Собственные коммиты автора не заменяют парное ревью.</w:t>
-      </w:r>
-    </w:p>
-    <w:p>
-      <w:r>
-        <w:br w:type="page"/>
-      </w:r>
-    </w:p>
-    <w:p>
-      <w:pPr>
-        <w:pStyle w:val="Heading1"/>
-      </w:pPr>
-      <w:r>
-        <w:t>8 Работа с Git в VS Code</w:t>
-      </w:r>
-    </w:p>
-    <w:p>
-      <w:r>
-        <w:rPr>
-          <w:b w:val="0"/>
-        </w:rPr>
-        <w:t>Папка проекта открыта в VS Code. В Source Control выбран изменённый hobby.md; редактор сравнения показывает исходную и новую версии. Добавлен критерий готовности, проверен diff и выполнен коммит docs: define hobby project acceptance criteria через интерфейс. Полученный коммит 4d4593f затем отправлен через CLI.</w:t>
-      </w:r>
-    </w:p>
-    <w:p>
-      <w:pPr>
-        <w:keepNext/>
-        <w:ind w:firstLine="0"/>
-        <w:jc w:val="center"/>
-      </w:pPr>
-      <w:r>
-        <w:drawing>
-          <wp:inline xmlns:a="http://schemas.openxmlformats.org/drawingml/2006/main" xmlns:pic="http://schemas.openxmlformats.org/drawingml/2006/picture">
-            <wp:extent cx="6048000" cy="3683477"/>
-            <wp:docPr id="7" name="Picture 7"/>
-            <wp:cNvGraphicFramePr>
-              <a:graphicFrameLocks noChangeAspect="1"/>
-            </wp:cNvGraphicFramePr>
-            <a:graphic>
-              <a:graphicData uri="http://schemas.openxmlformats.org/drawingml/2006/picture">
-                <pic:pic>
-                  <pic:nvPicPr>
-                    <pic:cNvPr id="0" name="07-vscode-diff.png"/>
-                    <pic:cNvPicPr/>
-                  </pic:nvPicPr>
-                  <pic:blipFill>
-                    <a:blip r:embed="rId16"/>
-                    <a:stretch>
-                      <a:fillRect/>
-                    </a:stretch>
-                  </pic:blipFill>
-                  <pic:spPr>
-                    <a:xfrm>
-                      <a:off x="0" y="0"/>
-                      <a:ext cx="6048000" cy="3683477"/>
-                    </a:xfrm>
-                    <a:prstGeom prst="rect"/>
-                  </pic:spPr>
-                </pic:pic>
-              </a:graphicData>
-            </a:graphic>
-          </wp:inline>
-        </w:drawing>
-      </w:r>
-    </w:p>
-    <w:p>
-      <w:pPr>
-        <w:pStyle w:val="Caption"/>
-        <w:ind w:firstLine="0"/>
-        <w:jc w:val="center"/>
-      </w:pPr>
-      <w:r>
-        <w:t>Рисунок 7 — Source Control, граф коммитов и diff файла hobby.md</w:t>
-      </w:r>
-    </w:p>
-    <w:p>
-      <w:r>
-        <w:rPr>
-          <w:b w:val="0"/>
-        </w:rPr>
-        <w:t>Установлен GitLens 19.1.0. Три удобные возможности: общий список изменений и индексация, сравнение версий рядом, граф истории и аннотации авторства. Для интерактивного rebase и воспроизводимого запуска проверок удобнее командная строка.</w:t>
-      </w:r>
-    </w:p>
-    <w:p>
-      <w:r>
-        <w:rPr>
-          <w:b w:val="0"/>
-        </w:rPr>
-        <w:t>Файл ide_notes.md содержит эти наблюдения. В соответствии с заданием он закоммичен и отправлен через CLI в ветке codex/course-notes, после чего включён в main через PR №8.</w:t>
-      </w:r>
-    </w:p>
-    <w:p>
-      <w:pPr>
-        <w:spacing w:after="140" w:line="240" w:lineRule="auto"/>
-        <w:ind w:firstLine="0"/>
-      </w:pPr>
-      <w:r>
-        <w:rPr>
-          <w:rFonts w:ascii="Consolas" w:hAnsi="Consolas"/>
-          <w:sz w:val="18"/>
-        </w:rPr>
-        <w:t>git add ide_notes.md</w:t>
-        <w:br/>
-        <w:t>git commit -m "docs: add IDE vs CLI notes"</w:t>
-        <w:br/>
-        <w:t>git push -u origin codex/course-notes</w:t>
-      </w:r>
-    </w:p>
-    <w:p>
-      <w:r>
-        <w:br w:type="page"/>
-      </w:r>
-    </w:p>
-    <w:p>
-      <w:pPr>
-        <w:pStyle w:val="Heading1"/>
-      </w:pPr>
-      <w:r>
-        <w:t>9 Проверка работоспособности</w:t>
-      </w:r>
-    </w:p>
-    <w:p>
-      <w:r>
-        <w:rPr>
-          <w:b w:val="0"/>
-        </w:rPr>
-        <w:t>Проверка выполнена командой python3 -m unittest discover -s tests -v. Все три интеграционных теста прошли. Каждый запускает настоящий CLI отдельным процессом и использует временное хранилище.</w:t>
-      </w:r>
-    </w:p>
-    <w:tbl>
-      <w:tblPr>
-        <w:tblW w:type="auto" w:w="0"/>
-        <w:tblLayout w:type="fixed"/>
-        <w:tblLook w:firstColumn="1" w:firstRow="1" w:lastColumn="0" w:lastRow="0" w:noHBand="0" w:noVBand="1" w:val="04A0"/>
-      </w:tblPr>
-      <w:tblGrid>
-        <w:gridCol w:w="3118"/>
-        <w:gridCol w:w="6520"/>
-      </w:tblGrid>
-      <w:tr>
-        <w:trPr>
-          <w:cantSplit/>
-          <w:tblHeader/>
-        </w:trPr>
-        <w:tc>
-          <w:tcPr>
-            <w:tcW w:type="dxa" w:w="3118"/>
-            <w:tcBorders>
-              <w:top w:val="single" w:sz="4" w:color="D9D9D9"/>
-              <w:left w:val="single" w:sz="4" w:color="D9D9D9"/>
-              <w:bottom w:val="single" w:sz="4" w:color="D9D9D9"/>
-              <w:right w:val="single" w:sz="4" w:color="D9D9D9"/>
-            </w:tcBorders>
-            <w:shd w:fill="E7EDF3"/>
-          </w:tcPr>
-          <w:p>
-            <w:pPr>
-              <w:spacing w:after="80" w:before="80"/>
-              <w:ind w:firstLine="0"/>
-            </w:pPr>
-            <w:r>
-              <w:rPr>
-                <w:b/>
-                <w:sz w:val="20"/>
-              </w:rPr>
-              <w:t>Проверка</w:t>
-            </w:r>
-          </w:p>
-        </w:tc>
-        <w:tc>
-          <w:tcPr>
-            <w:tcW w:type="dxa" w:w="6520"/>
-            <w:tcBorders>
-              <w:top w:val="single" w:sz="4" w:color="D9D9D9"/>
-              <w:left w:val="single" w:sz="4" w:color="D9D9D9"/>
-              <w:bottom w:val="single" w:sz="4" w:color="D9D9D9"/>
-              <w:right w:val="single" w:sz="4" w:color="D9D9D9"/>
-            </w:tcBorders>
-            <w:shd w:fill="E7EDF3"/>
-          </w:tcPr>
-          <w:p>
-            <w:pPr>
-              <w:spacing w:after="80" w:before="80"/>
-              <w:ind w:firstLine="0"/>
-            </w:pPr>
-            <w:r>
-              <w:rPr>
-                <w:b/>
-                <w:sz w:val="20"/>
-              </w:rPr>
-              <w:t>Подтверждённое поведение</w:t>
-            </w:r>
-          </w:p>
-        </w:tc>
-      </w:tr>
-      <w:tr>
-        <w:trPr>
-          <w:cantSplit/>
-        </w:trPr>
-        <w:tc>
-          <w:tcPr>
-            <w:tcW w:type="dxa" w:w="3118"/>
-            <w:tcBorders>
-              <w:top w:val="single" w:sz="4" w:color="D9D9D9"/>
-              <w:left w:val="single" w:sz="4" w:color="D9D9D9"/>
-              <w:bottom w:val="single" w:sz="4" w:color="D9D9D9"/>
-              <w:right w:val="single" w:sz="4" w:color="D9D9D9"/>
-            </w:tcBorders>
-          </w:tcPr>
-          <w:p>
-            <w:pPr>
-              <w:spacing w:after="80" w:before="80"/>
-              <w:ind w:firstLine="0"/>
-            </w:pPr>
-            <w:r>
-              <w:rPr>
-                <w:b w:val="0"/>
-                <w:sz w:val="20"/>
-              </w:rPr>
-              <w:t>Жизненный цикл</w:t>
-            </w:r>
-          </w:p>
-        </w:tc>
-        <w:tc>
-          <w:tcPr>
-            <w:tcW w:type="dxa" w:w="6520"/>
-            <w:tcBorders>
-              <w:top w:val="single" w:sz="4" w:color="D9D9D9"/>
-              <w:left w:val="single" w:sz="4" w:color="D9D9D9"/>
-              <w:bottom w:val="single" w:sz="4" w:color="D9D9D9"/>
-              <w:right w:val="single" w:sz="4" w:color="D9D9D9"/>
-            </w:tcBorders>
-          </w:tcPr>
-          <w:p>
-            <w:pPr>
-              <w:spacing w:after="80" w:before="80"/>
-              <w:ind w:firstLine="0"/>
-            </w:pPr>
-            <w:r>
-              <w:rPr>
-                <w:b w:val="0"/>
-                <w:sz w:val="20"/>
-              </w:rPr>
-              <w:t>Пустой список → две задачи → завершение первой → сохранённый статус</w:t>
-            </w:r>
-          </w:p>
-        </w:tc>
-      </w:tr>
-      <w:tr>
-        <w:trPr>
-          <w:cantSplit/>
-        </w:trPr>
-        <w:tc>
-          <w:tcPr>
-            <w:tcW w:type="dxa" w:w="3118"/>
-            <w:tcBorders>
-              <w:top w:val="single" w:sz="4" w:color="D9D9D9"/>
-              <w:left w:val="single" w:sz="4" w:color="D9D9D9"/>
-              <w:bottom w:val="single" w:sz="4" w:color="D9D9D9"/>
-              <w:right w:val="single" w:sz="4" w:color="D9D9D9"/>
-            </w:tcBorders>
-          </w:tcPr>
-          <w:p>
-            <w:pPr>
-              <w:spacing w:after="80" w:before="80"/>
-              <w:ind w:firstLine="0"/>
-            </w:pPr>
-            <w:r>
-              <w:rPr>
-                <w:b w:val="0"/>
-                <w:sz w:val="20"/>
-              </w:rPr>
-              <w:t>Некорректный ввод</w:t>
-            </w:r>
-          </w:p>
-        </w:tc>
-        <w:tc>
-          <w:tcPr>
-            <w:tcW w:type="dxa" w:w="6520"/>
-            <w:tcBorders>
-              <w:top w:val="single" w:sz="4" w:color="D9D9D9"/>
-              <w:left w:val="single" w:sz="4" w:color="D9D9D9"/>
-              <w:bottom w:val="single" w:sz="4" w:color="D9D9D9"/>
-              <w:right w:val="single" w:sz="4" w:color="D9D9D9"/>
-            </w:tcBorders>
-          </w:tcPr>
-          <w:p>
-            <w:pPr>
-              <w:spacing w:after="80" w:before="80"/>
-              <w:ind w:firstLine="0"/>
-            </w:pPr>
-            <w:r>
-              <w:rPr>
-                <w:b w:val="0"/>
-                <w:sz w:val="20"/>
-              </w:rPr>
-              <w:t>Пустое название и неизвестный номер отклонены, файл не изменён</w:t>
-            </w:r>
-          </w:p>
-        </w:tc>
-      </w:tr>
-      <w:tr>
-        <w:trPr>
-          <w:cantSplit/>
-        </w:trPr>
-        <w:tc>
-          <w:tcPr>
-            <w:tcW w:type="dxa" w:w="3118"/>
-            <w:tcBorders>
-              <w:top w:val="single" w:sz="4" w:color="D9D9D9"/>
-              <w:left w:val="single" w:sz="4" w:color="D9D9D9"/>
-              <w:bottom w:val="single" w:sz="4" w:color="D9D9D9"/>
-              <w:right w:val="single" w:sz="4" w:color="D9D9D9"/>
-            </w:tcBorders>
-          </w:tcPr>
-          <w:p>
-            <w:pPr>
-              <w:spacing w:after="80" w:before="80"/>
-              <w:ind w:firstLine="0"/>
-            </w:pPr>
-            <w:r>
-              <w:rPr>
-                <w:b w:val="0"/>
-                <w:sz w:val="20"/>
-              </w:rPr>
-              <w:t>Повреждённое хранилище</w:t>
-            </w:r>
-          </w:p>
-        </w:tc>
-        <w:tc>
-          <w:tcPr>
-            <w:tcW w:type="dxa" w:w="6520"/>
-            <w:tcBorders>
-              <w:top w:val="single" w:sz="4" w:color="D9D9D9"/>
-              <w:left w:val="single" w:sz="4" w:color="D9D9D9"/>
-              <w:bottom w:val="single" w:sz="4" w:color="D9D9D9"/>
-              <w:right w:val="single" w:sz="4" w:color="D9D9D9"/>
-            </w:tcBorders>
-          </w:tcPr>
-          <w:p>
-            <w:pPr>
-              <w:spacing w:after="80" w:before="80"/>
-              <w:ind w:firstLine="0"/>
-            </w:pPr>
-            <w:r>
-              <w:rPr>
-                <w:b w:val="0"/>
-                <w:sz w:val="20"/>
-              </w:rPr>
-              <w:t>Ошибочные JSON и структура данных отклонены без перезаписи</w:t>
-            </w:r>
-          </w:p>
-        </w:tc>
-      </w:tr>
-    </w:tbl>
-    <w:p>
-      <w:r>
-        <w:rPr>
-          <w:b w:val="0"/>
-        </w:rPr>
-      </w:r>
-    </w:p>
-    <w:p>
-      <w:pPr>
-        <w:keepNext/>
-        <w:ind w:firstLine="0"/>
-        <w:jc w:val="center"/>
-      </w:pPr>
-      <w:r>
-        <w:drawing>
-          <wp:inline xmlns:a="http://schemas.openxmlformats.org/drawingml/2006/main" xmlns:pic="http://schemas.openxmlformats.org/drawingml/2006/picture">
-            <wp:extent cx="6048000" cy="3683477"/>
-            <wp:docPr id="8" name="Picture 8"/>
-            <wp:cNvGraphicFramePr>
-              <a:graphicFrameLocks noChangeAspect="1"/>
-            </wp:cNvGraphicFramePr>
-            <a:graphic>
-              <a:graphicData uri="http://schemas.openxmlformats.org/drawingml/2006/picture">
-                <pic:pic>
-                  <pic:nvPicPr>
-                    <pic:cNvPr id="0" name="10-tests-and-demo.png"/>
-                    <pic:cNvPicPr/>
-                  </pic:nvPicPr>
-                  <pic:blipFill>
-                    <a:blip r:embed="rId17"/>
-                    <a:stretch>
-                      <a:fillRect/>
-                    </a:stretch>
-                  </pic:blipFill>
-                  <pic:spPr>
-                    <a:xfrm>
-                      <a:off x="0" y="0"/>
-                      <a:ext cx="6048000" cy="3683477"/>
-                    </a:xfrm>
-                    <a:prstGeom prst="rect"/>
-                  </pic:spPr>
-                </pic:pic>
-              </a:graphicData>
-            </a:graphic>
-          </wp:inline>
-        </w:drawing>
-      </w:r>
-    </w:p>
-    <w:p>
-      <w:pPr>
-        <w:pStyle w:val="Caption"/>
-        <w:ind w:firstLine="0"/>
-        <w:jc w:val="center"/>
-      </w:pPr>
-      <w:r>
-        <w:t>Рисунок 8 — Журнал тестов и последовательного запуска CLI</w:t>
-      </w:r>
-    </w:p>
-    <w:p>
-      <w:r>
-        <w:rPr>
-          <w:b w:val="0"/>
-        </w:rPr>
-        <w:t>Ручная демонстрация в журнале: список пуст, задача добавлена с номером 1, затем отмечена выполненной и отображается как [x]. Результаты сохранены в reports/evidence/tests-and-demo.txt. Программа рассчитана на последовательные запуски одного пользователя.</w:t>
-      </w:r>
-    </w:p>
-    <w:p>
-      <w:r>
-        <w:br w:type="page"/>
-      </w:r>
-    </w:p>
-    <w:p>
-      <w:pPr>
-        <w:pStyle w:val="Heading1"/>
-      </w:pPr>
-      <w:r>
-        <w:t>10 Упражнение rebase и сравнение SVN</w:t>
-      </w:r>
-    </w:p>
-    <w:p>
-      <w:r>
-        <w:rPr>
-          <w:b w:val="0"/>
-        </w:rPr>
-        <w:t>В локальной ветке practice/rebase-playground созданы три осмысленных коммита: индекс Git, ветки и безопасный rebase. Затем git rebase -i HEAD~3 объединил третий коммит со вторым через squash. Все три файла сохранились. Ветка не отправлялась на GitHub, как требует домашнее задание.</w:t>
-      </w:r>
-    </w:p>
-    <w:p>
-      <w:r>
-        <w:rPr>
-          <w:b/>
-        </w:rPr>
-        <w:t>До rebase</w:t>
-      </w:r>
-    </w:p>
-    <w:p>
-      <w:pPr>
-        <w:spacing w:after="140" w:line="240" w:lineRule="auto"/>
-        <w:ind w:firstLine="0"/>
-      </w:pPr>
-      <w:r>
-        <w:rPr>
-          <w:rFonts w:ascii="Consolas" w:hAnsi="Consolas"/>
-          <w:sz w:val="18"/>
-        </w:rPr>
-        <w:t>68f43d5 docs: explain safe rebase usage</w:t>
-        <w:br/>
-        <w:t>faf5486 docs: explain lightweight Git branches</w:t>
-        <w:br/>
-        <w:t>5f2dc5a docs: explain Git staging area</w:t>
-      </w:r>
-    </w:p>
-    <w:p>
-      <w:r>
-        <w:rPr>
-          <w:b/>
-        </w:rPr>
-        <w:t>После rebase</w:t>
-      </w:r>
-    </w:p>
-    <w:p>
-      <w:pPr>
-        <w:spacing w:after="140" w:line="240" w:lineRule="auto"/>
-        <w:ind w:firstLine="0"/>
-      </w:pPr>
-      <w:r>
-        <w:rPr>
-          <w:rFonts w:ascii="Consolas" w:hAnsi="Consolas"/>
-          <w:sz w:val="18"/>
-        </w:rPr>
-        <w:t>a14f1cf docs: explain lightweight Git branches</w:t>
-        <w:br/>
-        <w:t>5f2dc5a docs: explain Git staging area</w:t>
-      </w:r>
-    </w:p>
-    <w:p>
-      <w:r>
-        <w:rPr>
-          <w:b w:val="0"/>
-          <w:sz w:val="22"/>
-        </w:rPr>
-        <w:t>Для демонстрации: git switch practice/rebase-playground; git log --oneline main..HEAD. После просмотра: git switch main.</w:t>
-      </w:r>
-    </w:p>
-    <w:p>
-      <w:pPr>
-        <w:pStyle w:val="Heading1"/>
-      </w:pPr>
-      <w:r>
-        <w:t>Сравнение Git и SVN</w:t>
-      </w:r>
-    </w:p>
-    <w:p>
-      <w:r>
-        <w:rPr>
-          <w:b w:val="0"/>
-        </w:rPr>
-        <w:t>1. В Git ветка является ссылкой на коммит и создаётся локально. В SVN ветки обычно представлены копиями каталогов, но поддерживается cheap copy: физическое копирование всех данных не обязательно. Основное отличие — распределённая история Git и центральный репозиторий SVN.</w:t>
-      </w:r>
-    </w:p>
-    <w:p>
-      <w:r>
-        <w:rPr>
-          <w:b w:val="0"/>
-        </w:rPr>
-        <w:t>2. SVN-коммит требует доступа к репозиторию. Без интернета он возможен при локальном сервере или file://, но при недоступном удалённом сервере зафиксировать новую ревизию нельзя.</w:t>
-      </w:r>
-    </w:p>
-    <w:p>
-      <w:r>
-        <w:rPr>
-          <w:b w:val="0"/>
-        </w:rPr>
-        <w:t>3. SVN может быть удобен для существующих централизованных процессов, прав на отдельные каталоги и блокировки несводимых бинарных файлов. Выбор зависит от требований и стоимости перехода, а не от утверждения, что SVN всегда хуже.</w:t>
-      </w:r>
-    </w:p>
-    <w:p>
-      <w:r>
-        <w:rPr>
-          <w:b w:val="0"/>
-        </w:rPr>
-        <w:t>Полные ответы и ссылки: svn_comparison.md. Вопросы о DevOps, CALMS, GitHub Flow, SSH, DORA и merge/rebase разобраны в docs/self-check.md.</w:t>
-      </w:r>
-    </w:p>
-    <w:p>
-      <w:r>
-        <w:br w:type="page"/>
-      </w:r>
-    </w:p>
-    <w:p>
-      <w:pPr>
-        <w:pStyle w:val="Heading1"/>
-      </w:pPr>
-      <w:r>
-        <w:t>11 Результат и материалы для проверки</w:t>
-      </w:r>
-    </w:p>
-    <w:p>
-      <w:r>
-        <w:rPr>
-          <w:b w:val="0"/>
-        </w:rPr>
-        <w:t>Создана основа инфраструктуры проекта: публичный GitHub-репозиторий, задачи, документация, локальный Git и связь origin, структура исходников и проверок. Изменения опубликованы, программа выполняет заявленные действия. Отчёт содержит настоящие скриншоты и ссылки на результаты.</w:t>
-      </w:r>
-    </w:p>
-    <w:tbl>
-      <w:tblPr>
-        <w:tblW w:type="auto" w:w="0"/>
-        <w:tblLayout w:type="fixed"/>
-        <w:tblLook w:firstColumn="1" w:firstRow="1" w:lastColumn="0" w:lastRow="0" w:noHBand="0" w:noVBand="1" w:val="04A0"/>
-      </w:tblPr>
-      <w:tblGrid>
-        <w:gridCol w:w="2494"/>
-        <w:gridCol w:w="7143"/>
-      </w:tblGrid>
-      <w:tr>
-        <w:trPr>
-          <w:cantSplit/>
-          <w:tblHeader/>
-        </w:trPr>
-        <w:tc>
-          <w:tcPr>
-            <w:tcW w:type="dxa" w:w="2494"/>
-            <w:tcBorders>
-              <w:top w:val="single" w:sz="4" w:color="D9D9D9"/>
-              <w:left w:val="single" w:sz="4" w:color="D9D9D9"/>
-              <w:bottom w:val="single" w:sz="4" w:color="D9D9D9"/>
-              <w:right w:val="single" w:sz="4" w:color="D9D9D9"/>
-            </w:tcBorders>
-            <w:shd w:fill="E7EDF3"/>
-          </w:tcPr>
-          <w:p>
-            <w:pPr>
-              <w:spacing w:after="80" w:before="80"/>
-              <w:ind w:firstLine="0"/>
-            </w:pPr>
-            <w:r>
-              <w:rPr>
-                <w:b/>
-                <w:sz w:val="20"/>
-              </w:rPr>
-              <w:t>Материал</w:t>
-            </w:r>
-          </w:p>
-        </w:tc>
-        <w:tc>
-          <w:tcPr>
-            <w:tcW w:type="dxa" w:w="7143"/>
-            <w:tcBorders>
-              <w:top w:val="single" w:sz="4" w:color="D9D9D9"/>
-              <w:left w:val="single" w:sz="4" w:color="D9D9D9"/>
-              <w:bottom w:val="single" w:sz="4" w:color="D9D9D9"/>
-              <w:right w:val="single" w:sz="4" w:color="D9D9D9"/>
-            </w:tcBorders>
-            <w:shd w:fill="E7EDF3"/>
-          </w:tcPr>
-          <w:p>
-            <w:pPr>
-              <w:spacing w:after="80" w:before="80"/>
-              <w:ind w:firstLine="0"/>
-            </w:pPr>
-            <w:r>
-              <w:rPr>
-                <w:b/>
-                <w:sz w:val="20"/>
-              </w:rPr>
-              <w:t>Местоположение</w:t>
-            </w:r>
-          </w:p>
-        </w:tc>
-      </w:tr>
-      <w:tr>
-        <w:trPr>
-          <w:cantSplit/>
-        </w:trPr>
-        <w:tc>
-          <w:tcPr>
-            <w:tcW w:type="dxa" w:w="2494"/>
-            <w:tcBorders>
-              <w:top w:val="single" w:sz="4" w:color="D9D9D9"/>
-              <w:left w:val="single" w:sz="4" w:color="D9D9D9"/>
-              <w:bottom w:val="single" w:sz="4" w:color="D9D9D9"/>
-              <w:right w:val="single" w:sz="4" w:color="D9D9D9"/>
-            </w:tcBorders>
-          </w:tcPr>
-          <w:p>
-            <w:pPr>
-              <w:spacing w:after="80" w:before="80"/>
-              <w:ind w:firstLine="0"/>
-            </w:pPr>
-            <w:r>
-              <w:rPr>
-                <w:b w:val="0"/>
-                <w:sz w:val="20"/>
-              </w:rPr>
-              <w:t>Репозиторий</w:t>
-            </w:r>
-          </w:p>
-        </w:tc>
-        <w:tc>
-          <w:tcPr>
-            <w:tcW w:type="dxa" w:w="7143"/>
-            <w:tcBorders>
-              <w:top w:val="single" w:sz="4" w:color="D9D9D9"/>
-              <w:left w:val="single" w:sz="4" w:color="D9D9D9"/>
-              <w:bottom w:val="single" w:sz="4" w:color="D9D9D9"/>
-              <w:right w:val="single" w:sz="4" w:color="D9D9D9"/>
-            </w:tcBorders>
-          </w:tcPr>
-          <w:p>
-            <w:pPr>
-              <w:spacing w:after="80" w:before="80"/>
-              <w:ind w:firstLine="0"/>
-            </w:pPr>
-            <w:r>
-              <w:rPr>
-                <w:b w:val="0"/>
-                <w:sz w:val="20"/>
-              </w:rPr>
-              <w:t>https://github.com/blur3773/devops-course-2026</w:t>
-            </w:r>
-          </w:p>
-        </w:tc>
-      </w:tr>
-      <w:tr>
-        <w:trPr>
-          <w:cantSplit/>
-        </w:trPr>
-        <w:tc>
-          <w:tcPr>
-            <w:tcW w:type="dxa" w:w="2494"/>
-            <w:tcBorders>
-              <w:top w:val="single" w:sz="4" w:color="D9D9D9"/>
-              <w:left w:val="single" w:sz="4" w:color="D9D9D9"/>
-              <w:bottom w:val="single" w:sz="4" w:color="D9D9D9"/>
-              <w:right w:val="single" w:sz="4" w:color="D9D9D9"/>
-            </w:tcBorders>
-          </w:tcPr>
-          <w:p>
-            <w:pPr>
-              <w:spacing w:after="80" w:before="80"/>
-              <w:ind w:firstLine="0"/>
-            </w:pPr>
-            <w:r>
-              <w:rPr>
-                <w:b w:val="0"/>
-                <w:sz w:val="20"/>
-              </w:rPr>
-              <w:t>Задачи</w:t>
-            </w:r>
-          </w:p>
-        </w:tc>
-        <w:tc>
-          <w:tcPr>
-            <w:tcW w:type="dxa" w:w="7143"/>
-            <w:tcBorders>
-              <w:top w:val="single" w:sz="4" w:color="D9D9D9"/>
-              <w:left w:val="single" w:sz="4" w:color="D9D9D9"/>
-              <w:bottom w:val="single" w:sz="4" w:color="D9D9D9"/>
-              <w:right w:val="single" w:sz="4" w:color="D9D9D9"/>
-            </w:tcBorders>
-          </w:tcPr>
-          <w:p>
-            <w:pPr>
-              <w:spacing w:after="80" w:before="80"/>
-              <w:ind w:firstLine="0"/>
-            </w:pPr>
-            <w:r>
-              <w:rPr>
-                <w:b w:val="0"/>
-                <w:sz w:val="20"/>
-              </w:rPr>
-              <w:t>GitHub Issues №1–5 и TASKS.md</w:t>
-            </w:r>
-          </w:p>
-        </w:tc>
-      </w:tr>
-      <w:tr>
-        <w:trPr>
-          <w:cantSplit/>
-        </w:trPr>
-        <w:tc>
-          <w:tcPr>
-            <w:tcW w:type="dxa" w:w="2494"/>
-            <w:tcBorders>
-              <w:top w:val="single" w:sz="4" w:color="D9D9D9"/>
-              <w:left w:val="single" w:sz="4" w:color="D9D9D9"/>
-              <w:bottom w:val="single" w:sz="4" w:color="D9D9D9"/>
-              <w:right w:val="single" w:sz="4" w:color="D9D9D9"/>
-            </w:tcBorders>
-          </w:tcPr>
-          <w:p>
-            <w:pPr>
-              <w:spacing w:after="80" w:before="80"/>
-              <w:ind w:firstLine="0"/>
-            </w:pPr>
-            <w:r>
-              <w:rPr>
-                <w:b w:val="0"/>
-                <w:sz w:val="20"/>
-              </w:rPr>
-              <w:t>Документация</w:t>
-            </w:r>
-          </w:p>
-        </w:tc>
-        <w:tc>
-          <w:tcPr>
-            <w:tcW w:type="dxa" w:w="7143"/>
-            <w:tcBorders>
-              <w:top w:val="single" w:sz="4" w:color="D9D9D9"/>
-              <w:left w:val="single" w:sz="4" w:color="D9D9D9"/>
-              <w:bottom w:val="single" w:sz="4" w:color="D9D9D9"/>
-              <w:right w:val="single" w:sz="4" w:color="D9D9D9"/>
-            </w:tcBorders>
-          </w:tcPr>
-          <w:p>
-            <w:pPr>
-              <w:spacing w:after="80" w:before="80"/>
-              <w:ind w:firstLine="0"/>
-            </w:pPr>
-            <w:r>
-              <w:rPr>
-                <w:b w:val="0"/>
-                <w:sz w:val="20"/>
-              </w:rPr>
-              <w:t>docs/README.md, docs/self-check.md, svn_comparison.md</w:t>
-            </w:r>
-          </w:p>
-        </w:tc>
-      </w:tr>
-      <w:tr>
-        <w:trPr>
-          <w:cantSplit/>
-        </w:trPr>
-        <w:tc>
-          <w:tcPr>
-            <w:tcW w:type="dxa" w:w="2494"/>
-            <w:tcBorders>
-              <w:top w:val="single" w:sz="4" w:color="D9D9D9"/>
-              <w:left w:val="single" w:sz="4" w:color="D9D9D9"/>
-              <w:bottom w:val="single" w:sz="4" w:color="D9D9D9"/>
-              <w:right w:val="single" w:sz="4" w:color="D9D9D9"/>
-            </w:tcBorders>
-          </w:tcPr>
-          <w:p>
-            <w:pPr>
-              <w:spacing w:after="80" w:before="80"/>
-              <w:ind w:firstLine="0"/>
-            </w:pPr>
-            <w:r>
-              <w:rPr>
-                <w:b w:val="0"/>
-                <w:sz w:val="20"/>
-              </w:rPr>
-              <w:t>Слияния</w:t>
-            </w:r>
-          </w:p>
-        </w:tc>
-        <w:tc>
-          <w:tcPr>
-            <w:tcW w:type="dxa" w:w="7143"/>
-            <w:tcBorders>
-              <w:top w:val="single" w:sz="4" w:color="D9D9D9"/>
-              <w:left w:val="single" w:sz="4" w:color="D9D9D9"/>
-              <w:bottom w:val="single" w:sz="4" w:color="D9D9D9"/>
-              <w:right w:val="single" w:sz="4" w:color="D9D9D9"/>
-            </w:tcBorders>
-          </w:tcPr>
-          <w:p>
-            <w:pPr>
-              <w:spacing w:after="80" w:before="80"/>
-              <w:ind w:firstLine="0"/>
-            </w:pPr>
-            <w:r>
-              <w:rPr>
-                <w:b w:val="0"/>
-                <w:sz w:val="20"/>
-              </w:rPr>
-              <w:t>PR №6 — инфраструктура; PR №8 — заметки и журналы</w:t>
-            </w:r>
-          </w:p>
-        </w:tc>
-      </w:tr>
-      <w:tr>
-        <w:trPr>
-          <w:cantSplit/>
-        </w:trPr>
-        <w:tc>
-          <w:tcPr>
-            <w:tcW w:type="dxa" w:w="2494"/>
-            <w:tcBorders>
-              <w:top w:val="single" w:sz="4" w:color="D9D9D9"/>
-              <w:left w:val="single" w:sz="4" w:color="D9D9D9"/>
-              <w:bottom w:val="single" w:sz="4" w:color="D9D9D9"/>
-              <w:right w:val="single" w:sz="4" w:color="D9D9D9"/>
-            </w:tcBorders>
-          </w:tcPr>
-          <w:p>
-            <w:pPr>
-              <w:spacing w:after="80" w:before="80"/>
-              <w:ind w:firstLine="0"/>
-            </w:pPr>
-            <w:r>
-              <w:rPr>
-                <w:b w:val="0"/>
-                <w:sz w:val="20"/>
-              </w:rPr>
-              <w:t>Парное ревью</w:t>
-            </w:r>
-          </w:p>
-        </w:tc>
-        <w:tc>
-          <w:tcPr>
-            <w:tcW w:type="dxa" w:w="7143"/>
-            <w:tcBorders>
-              <w:top w:val="single" w:sz="4" w:color="D9D9D9"/>
-              <w:left w:val="single" w:sz="4" w:color="D9D9D9"/>
-              <w:bottom w:val="single" w:sz="4" w:color="D9D9D9"/>
-              <w:right w:val="single" w:sz="4" w:color="D9D9D9"/>
-            </w:tcBorders>
-          </w:tcPr>
-          <w:p>
-            <w:pPr>
-              <w:spacing w:after="80" w:before="80"/>
-              <w:ind w:firstLine="0"/>
-            </w:pPr>
-            <w:r>
-              <w:rPr>
-                <w:b w:val="0"/>
-                <w:sz w:val="20"/>
-              </w:rPr>
-              <w:t>PR №7 открыт; ожидается другой участник</w:t>
-            </w:r>
-          </w:p>
-        </w:tc>
-      </w:tr>
-      <w:tr>
-        <w:trPr>
-          <w:cantSplit/>
-        </w:trPr>
-        <w:tc>
-          <w:tcPr>
-            <w:tcW w:type="dxa" w:w="2494"/>
-            <w:tcBorders>
-              <w:top w:val="single" w:sz="4" w:color="D9D9D9"/>
-              <w:left w:val="single" w:sz="4" w:color="D9D9D9"/>
-              <w:bottom w:val="single" w:sz="4" w:color="D9D9D9"/>
-              <w:right w:val="single" w:sz="4" w:color="D9D9D9"/>
-            </w:tcBorders>
-          </w:tcPr>
-          <w:p>
-            <w:pPr>
-              <w:spacing w:after="80" w:before="80"/>
-              <w:ind w:firstLine="0"/>
-            </w:pPr>
-            <w:r>
-              <w:rPr>
-                <w:b w:val="0"/>
-                <w:sz w:val="20"/>
-              </w:rPr>
-              <w:t>Подтверждения</w:t>
-            </w:r>
-          </w:p>
-        </w:tc>
-        <w:tc>
-          <w:tcPr>
-            <w:tcW w:type="dxa" w:w="7143"/>
-            <w:tcBorders>
-              <w:top w:val="single" w:sz="4" w:color="D9D9D9"/>
-              <w:left w:val="single" w:sz="4" w:color="D9D9D9"/>
-              <w:bottom w:val="single" w:sz="4" w:color="D9D9D9"/>
-              <w:right w:val="single" w:sz="4" w:color="D9D9D9"/>
-            </w:tcBorders>
-          </w:tcPr>
-          <w:p>
-            <w:pPr>
-              <w:spacing w:after="80" w:before="80"/>
-              <w:ind w:firstLine="0"/>
-            </w:pPr>
-            <w:r>
-              <w:rPr>
-                <w:b w:val="0"/>
-                <w:sz w:val="20"/>
-              </w:rPr>
-              <w:t>reports/screenshots и reports/evidence</w:t>
-            </w:r>
-          </w:p>
-        </w:tc>
-      </w:tr>
-      <w:tr>
-        <w:trPr>
-          <w:cantSplit/>
-        </w:trPr>
-        <w:tc>
-          <w:tcPr>
-            <w:tcW w:type="dxa" w:w="2494"/>
-            <w:tcBorders>
-              <w:top w:val="single" w:sz="4" w:color="D9D9D9"/>
-              <w:left w:val="single" w:sz="4" w:color="D9D9D9"/>
-              <w:bottom w:val="single" w:sz="4" w:color="D9D9D9"/>
-              <w:right w:val="single" w:sz="4" w:color="D9D9D9"/>
-            </w:tcBorders>
-          </w:tcPr>
-          <w:p>
-            <w:pPr>
-              <w:spacing w:after="80" w:before="80"/>
-              <w:ind w:firstLine="0"/>
-            </w:pPr>
-            <w:r>
-              <w:rPr>
-                <w:b w:val="0"/>
-                <w:sz w:val="20"/>
-              </w:rPr>
-              <w:t>Локальное упражнение</w:t>
-            </w:r>
-          </w:p>
-        </w:tc>
-        <w:tc>
-          <w:tcPr>
-            <w:tcW w:type="dxa" w:w="7143"/>
-            <w:tcBorders>
-              <w:top w:val="single" w:sz="4" w:color="D9D9D9"/>
-              <w:left w:val="single" w:sz="4" w:color="D9D9D9"/>
-              <w:bottom w:val="single" w:sz="4" w:color="D9D9D9"/>
-              <w:right w:val="single" w:sz="4" w:color="D9D9D9"/>
-            </w:tcBorders>
-          </w:tcPr>
-          <w:p>
-            <w:pPr>
-              <w:spacing w:after="80" w:before="80"/>
-              <w:ind w:firstLine="0"/>
-            </w:pPr>
-            <w:r>
-              <w:rPr>
-                <w:b w:val="0"/>
-                <w:sz w:val="20"/>
-              </w:rPr>
-              <w:t>practice/rebase-playground, два коммита после squash</w:t>
-            </w:r>
-          </w:p>
-        </w:tc>
-      </w:tr>
-    </w:tbl>
-    <w:p>
-      <w:r>
-        <w:rPr>
-          <w:b w:val="0"/>
-        </w:rPr>
-      </w:r>
-    </w:p>
-    <w:p>
-      <w:r>
-        <w:rPr>
-          <w:b/>
-        </w:rPr>
-        <w:t>Для завершения расширенной парной части требуется реальный отзыв одногруппника или преподавателя. Пока отзыв отсутствует, скриншот чужого комментария и одобрение не представлены. Публикация в GitHub и готовность файла отчёта не означают отправку ответа в СДО.</w:t>
-      </w:r>
-    </w:p>
-    <w:p>
-      <w:pPr>
-        <w:pStyle w:val="Heading1"/>
-      </w:pPr>
-      <w:r>
-        <w:t>Источники</w:t>
-      </w:r>
-    </w:p>
-    <w:p>
-      <w:r>
-        <w:rPr>
-          <w:b w:val="0"/>
-          <w:sz w:val="18"/>
-        </w:rPr>
-        <w:t>1. СДО РТУ МИРЭА. Контрольная работа №1, вложение «Практическая работа №1-2.docx». https://online-edu.mirea.ru/mod/assign/view.php?id=931533</w:t>
-      </w:r>
-    </w:p>
-    <w:p>
-      <w:r>
-        <w:rPr>
-          <w:b w:val="0"/>
-          <w:sz w:val="18"/>
-        </w:rPr>
-        <w:t>2. СДО РТУ МИРЭА. Практические работы №1 и №2, 2026/2027. https://online-edu.mirea.ru/mod/folder/view.php?id=931531</w:t>
-      </w:r>
-    </w:p>
-    <w:p>
-      <w:r>
-        <w:rPr>
-          <w:b w:val="0"/>
-          <w:sz w:val="18"/>
-        </w:rPr>
-        <w:t>3. Pro Git. Branches in a Nutshell. https://git-scm.com/book/en/v2/Git-Branching-Branches-in-a-Nutshell</w:t>
-      </w:r>
-    </w:p>
-    <w:p>
-      <w:r>
-        <w:rPr>
-          <w:b w:val="0"/>
-          <w:sz w:val="18"/>
-        </w:rPr>
-        <w:t>4. Apache Subversion FAQ. https://subversion.apache.org/faq.html</w:t>
-      </w:r>
-    </w:p>
-    <w:p>
-      <w:r>
-        <w:rPr>
-          <w:b w:val="0"/>
-          <w:sz w:val="18"/>
-        </w:rPr>
-        <w:t>5. GitHub Docs. SSH key fingerprints. https://docs.github.com/en/authentication/keeping-your-account-and-data-secure/githubs-ssh-key-fingerprints</w:t>
-      </w:r>
-    </w:p>
-    <w:p>
-      <w:r>
-        <w:rPr>
-          <w:b w:val="0"/>
-          <w:sz w:val="18"/>
-        </w:rPr>
-        <w:t>Дата обращения к электронным материалам: 11.09.2026.</w:t>
+        <w:t>В ходе практической работы подготовлена инфраструктура проекта: настроены репозитории Git, создана структура файлов и документация, организован список задач. Освоены фиксация изменений и их публикация в GitHub.</w:t>
       </w:r>
     </w:p>
     <w:sectPr>
       <w:footerReference w:type="default" r:id="rId9"/>
-      <w:pgSz w:w="11906" w:h="16838"/>
-      <w:pgMar w:top="1020" w:right="1134" w:bottom="1020" w:left="1134" w:header="397" w:footer="397" w:gutter="0"/>
+      <w:pgSz w:w="12240" w:h="15840"/>
+      <w:pgMar w:top="1008" w:right="1080" w:bottom="936" w:left="1224" w:header="720" w:footer="720" w:gutter="0"/>
       <w:cols w:space="720"/>
-      <w:titlePg/>
       <w:docGrid w:linePitch="360"/>
     </w:sectPr>
   </w:body>
@@ -2388,6 +883,7 @@
       <w:pStyle w:val="Footer"/>
       <w:jc w:val="center"/>
     </w:pPr>
+    <w:r/>
     <w:fldSimple w:instr="PAGE"/>
   </w:p>
 </w:ftr>
@@ -2757,12 +1253,10 @@
     <w:qFormat/>
     <w:rsid w:val="00FC693F"/>
     <w:pPr>
-      <w:spacing w:after="140" w:line="259" w:lineRule="auto"/>
-      <w:ind w:firstLine="340"/>
+      <w:spacing w:line="276" w:lineRule="auto" w:after="120"/>
     </w:pPr>
     <w:rPr>
-      <w:rFonts w:ascii="Times New Roman" w:hAnsi="Times New Roman" w:eastAsia="Times New Roman" w:cs="Times New Roman"/>
-      <w:color w:val="000000"/>
+      <w:rFonts w:ascii="Times New Roman" w:hAnsi="Times New Roman" w:eastAsia="Times New Roman"/>
       <w:sz w:val="24"/>
     </w:rPr>
   </w:style>
@@ -2821,15 +1315,15 @@
     <w:pPr>
       <w:keepNext/>
       <w:keepLines/>
-      <w:spacing w:before="480" w:after="140" w:line="259" w:lineRule="auto"/>
+      <w:spacing w:before="480" w:after="0"/>
       <w:outlineLvl w:val="0"/>
     </w:pPr>
     <w:rPr>
-      <w:rFonts w:cstheme="majorBidi" w:ascii="Times New Roman" w:hAnsi="Times New Roman" w:eastAsia="Times New Roman" w:cs="Times New Roman"/>
+      <w:rFonts w:asciiTheme="majorHAnsi" w:eastAsiaTheme="majorEastAsia" w:hAnsiTheme="majorHAnsi" w:cstheme="majorBidi" w:ascii="Times New Roman" w:hAnsi="Times New Roman" w:eastAsia="Times New Roman"/>
       <w:b/>
       <w:bCs/>
       <w:color w:val="000000"/>
-      <w:sz w:val="28"/>
+      <w:sz w:val="30"/>
       <w:szCs w:val="28"/>
     </w:rPr>
   </w:style>
@@ -2845,15 +1339,15 @@
     <w:pPr>
       <w:keepNext/>
       <w:keepLines/>
-      <w:spacing w:before="200" w:after="140" w:line="259" w:lineRule="auto"/>
+      <w:spacing w:before="200" w:after="0"/>
       <w:outlineLvl w:val="1"/>
     </w:pPr>
     <w:rPr>
-      <w:rFonts w:cstheme="majorBidi" w:ascii="Times New Roman" w:hAnsi="Times New Roman" w:eastAsia="Times New Roman" w:cs="Times New Roman"/>
+      <w:rFonts w:asciiTheme="majorHAnsi" w:eastAsiaTheme="majorEastAsia" w:hAnsiTheme="majorHAnsi" w:cstheme="majorBidi" w:ascii="Times New Roman" w:hAnsi="Times New Roman" w:eastAsia="Times New Roman"/>
       <w:b/>
       <w:bCs/>
       <w:color w:val="000000"/>
-      <w:sz w:val="24"/>
+      <w:sz w:val="26"/>
       <w:szCs w:val="26"/>
     </w:rPr>
   </w:style>
@@ -3107,15 +1601,19 @@
     <w:qFormat/>
     <w:rsid w:val="00FC693F"/>
     <w:pPr>
-      <w:spacing w:after="140" w:line="259" w:lineRule="auto"/>
+      <w:pBdr>
+        <w:bottom w:val="single" w:sz="8" w:space="4" w:color="4F81BD" w:themeColor="accent1"/>
+      </w:pBdr>
+      <w:spacing w:after="300" w:line="240" w:lineRule="auto"/>
       <w:contextualSpacing/>
     </w:pPr>
     <w:rPr>
-      <w:rFonts w:cstheme="majorBidi" w:ascii="Times New Roman" w:hAnsi="Times New Roman" w:eastAsia="Times New Roman" w:cs="Times New Roman"/>
+      <w:rFonts w:asciiTheme="majorHAnsi" w:eastAsiaTheme="majorEastAsia" w:hAnsiTheme="majorHAnsi" w:cstheme="majorBidi" w:ascii="Times New Roman" w:hAnsi="Times New Roman" w:eastAsia="Times New Roman"/>
+      <w:b/>
       <w:color w:val="000000"/>
       <w:spacing w:val="5"/>
       <w:kern w:val="28"/>
-      <w:sz w:val="32"/>
+      <w:sz w:val="36"/>
       <w:szCs w:val="52"/>
     </w:rPr>
   </w:style>
@@ -3146,13 +1644,12 @@
       <w:numPr>
         <w:ilvl w:val="1"/>
       </w:numPr>
-      <w:spacing w:after="140" w:line="259" w:lineRule="auto"/>
     </w:pPr>
     <w:rPr>
-      <w:rFonts w:cstheme="majorBidi" w:ascii="Times New Roman" w:hAnsi="Times New Roman" w:eastAsia="Times New Roman" w:cs="Times New Roman"/>
+      <w:rFonts w:asciiTheme="majorHAnsi" w:eastAsiaTheme="majorEastAsia" w:hAnsiTheme="majorHAnsi" w:cstheme="majorBidi"/>
       <w:i/>
       <w:iCs/>
-      <w:color w:val="000000"/>
+      <w:color w:val="4F81BD" w:themeColor="accent1"/>
       <w:spacing w:val="15"/>
       <w:sz w:val="24"/>
       <w:szCs w:val="24"/>
@@ -3551,15 +2048,13 @@
     <w:qFormat/>
     <w:rsid w:val="00FC693F"/>
     <w:pPr>
-      <w:spacing w:line="259" w:lineRule="auto" w:after="140"/>
+      <w:spacing w:line="240" w:lineRule="auto"/>
     </w:pPr>
     <w:rPr>
-      <w:rFonts w:ascii="Times New Roman" w:hAnsi="Times New Roman" w:eastAsia="Times New Roman" w:cs="Times New Roman"/>
       <w:b/>
       <w:bCs/>
-      <w:i/>
-      <w:color w:val="000000"/>
-      <w:sz w:val="20"/>
+      <w:color w:val="4F81BD" w:themeColor="accent1"/>
+      <w:sz w:val="18"/>
       <w:szCs w:val="18"/>
     </w:rPr>
   </w:style>
@@ -3594,6 +2089,9 @@
     <w:qFormat/>
     <w:rsid w:val="00FC693F"/>
     <w:pPr>
+      <w:pBdr>
+        <w:bottom w:val="single" w:sz="4" w:space="4" w:color="4F81BD" w:themeColor="accent1"/>
+      </w:pBdr>
       <w:spacing w:before="200" w:after="280"/>
       <w:ind w:left="936" w:right="936"/>
     </w:pPr>

</xml_diff>